<commit_message>
Add external data safeguards and project helpers
Co-authored-by: Copilot <223556219+Copilot@users.noreply.github.com>
</commit_message>
<xml_diff>
--- a/templates/reference_report.docx
+++ b/templates/reference_report.docx
@@ -1,6 +1,6 @@
 
 <file path=word/document.xml><?xml version="1.0" encoding="utf-8"?>
-<w:document xmlns:o="urn:schemas-microsoft-com:office:office" xmlns:r="http://schemas.openxmlformats.org/officeDocument/2006/relationships" xmlns:v="urn:schemas-microsoft-com:vml" xmlns:w="http://schemas.openxmlformats.org/wordprocessingml/2006/main" xmlns:w10="urn:schemas-microsoft-com:office:word" xmlns:wp="http://schemas.openxmlformats.org/drawingml/2006/wordprocessingDrawing" xmlns:pic="http://schemas.openxmlformats.org/drawingml/2006/picture" xmlns:wps="http://schemas.microsoft.com/office/word/2010/wordprocessingShape" xmlns:wpg="http://schemas.microsoft.com/office/word/2010/wordprocessingGroup" xmlns:mc="http://schemas.openxmlformats.org/markup-compatibility/2006" xmlns:wp14="http://schemas.microsoft.com/office/word/2010/wordprocessingDrawing" xmlns:w14="http://schemas.microsoft.com/office/word/2010/wordml" xmlns:w15="http://schemas.microsoft.com/office/word/2012/wordml" mc:Ignorable="w14 wp14 w15">
+<w:document xmlns:wpc="http://schemas.microsoft.com/office/word/2010/wordprocessingCanvas" xmlns:cx="http://schemas.microsoft.com/office/drawing/2014/chartex" xmlns:cx1="http://schemas.microsoft.com/office/drawing/2015/9/8/chartex" xmlns:cx2="http://schemas.microsoft.com/office/drawing/2015/10/21/chartex" xmlns:cx3="http://schemas.microsoft.com/office/drawing/2016/5/9/chartex" xmlns:cx4="http://schemas.microsoft.com/office/drawing/2016/5/10/chartex" xmlns:cx5="http://schemas.microsoft.com/office/drawing/2016/5/11/chartex" xmlns:cx6="http://schemas.microsoft.com/office/drawing/2016/5/12/chartex" xmlns:cx7="http://schemas.microsoft.com/office/drawing/2016/5/13/chartex" xmlns:cx8="http://schemas.microsoft.com/office/drawing/2016/5/14/chartex" xmlns:mc="http://schemas.openxmlformats.org/markup-compatibility/2006" xmlns:m="http://schemas.openxmlformats.org/officeDocument/2006/math" xmlns:aink="http://schemas.microsoft.com/office/drawing/2016/ink" xmlns:am3d="http://schemas.microsoft.com/office/drawing/2017/model3d" xmlns:oel="http://schemas.microsoft.com/office/2019/extlst" xmlns:r="http://schemas.openxmlformats.org/officeDocument/2006/relationships" xmlns:wp14="http://schemas.microsoft.com/office/word/2010/wordprocessingDrawing" xmlns:wp="http://schemas.openxmlformats.org/drawingml/2006/wordprocessingDrawing" xmlns:wpg="http://schemas.microsoft.com/office/word/2010/wordprocessingGroup" xmlns:wpi="http://schemas.microsoft.com/office/word/2010/wordprocessingInk" xmlns:wps="http://schemas.microsoft.com/office/word/2010/wordprocessingShape" xmlns:o="urn:schemas-microsoft-com:office:office" xmlns:v="urn:schemas-microsoft-com:vml" xmlns:w10="urn:schemas-microsoft-com:office:word" xmlns:w="http://schemas.openxmlformats.org/wordprocessingml/2006/main" xmlns:w14="http://schemas.microsoft.com/office/word/2010/wordml" xmlns:w15="http://schemas.microsoft.com/office/word/2012/wordml" xmlns:w16cex="http://schemas.microsoft.com/office/word/2018/wordml/cex" xmlns:w16cid="http://schemas.microsoft.com/office/word/2016/wordml/cid" xmlns:w16="http://schemas.microsoft.com/office/word/2018/wordml" xmlns:w16sdtdh="http://schemas.microsoft.com/office/word/2020/wordml/sdtdatahash" xmlns:w16sdtfl="http://schemas.microsoft.com/office/word/2024/wordml/sdtformatlock" xmlns:w16se="http://schemas.microsoft.com/office/word/2015/wordml/symex" xmlns:w16du="http://schemas.microsoft.com/office/word/2023/wordml/word16du" xmlns:wne="http://schemas.microsoft.com/office/word/2006/wordml" mc:Ignorable="w14 w15 w16se w16cid w16 w16cex w16sdtdh w16sdtfl w16du wp14">
   <w:body>
     <w:p>
       <w:pPr>
@@ -39,7 +39,7 @@
         <w:pStyle w:val="Heading1"/>
         <w:rPr/>
       </w:pPr>
-      <w:bookmarkStart w:id="0" w:name="bm13"/>
+      <w:bookmarkStart w:id="0" w:name="bm6"/>
       <w:r>
         <w:rPr/>
         <w:t>aliqua ut enim ad</w:t>
@@ -76,7 +76,7 @@
         <w:rPr/>
         <w:t>voluptate velit esse cillum dolore eu fugiat nulla pariatur excepteur sint occaecat cupidatat non proident sunt</w:t>
       </w:r>
-      <w:hyperlink w:anchor="bm7">
+      <w:hyperlink w:anchor="bm4">
         <w:r>
           <w:rPr>
             <w:rStyle w:val="Hyperlink"/>
@@ -88,7 +88,7 @@
         <w:rPr/>
         <w:t>qui officia deserunt mollit anim id est laborum lorem ipsum dolor sit amet consectetur adipiscing elit sed do eiusmod tempor incididunt ut labore et dolore magna aliqua ut enim ad minim veniam quis nostrud exercitation ullamco laboris nisi ut aliquip ex ea commodo consequat duis aute irure dolor in reprehenderit in voluptate velit esse cillum dolore eu</w:t>
       </w:r>
-      <w:hyperlink w:anchor="bm6">
+      <w:hyperlink w:anchor="bm3">
         <w:r>
           <w:rPr>
             <w:rStyle w:val="Hyperlink"/>
@@ -100,7 +100,7 @@
         <w:rPr/>
         <w:t xml:space="preserve">; </w:t>
       </w:r>
-      <w:hyperlink w:anchor="bm8">
+      <w:hyperlink w:anchor="bm5">
         <w:r>
           <w:rPr>
             <w:rStyle w:val="Hyperlink"/>
@@ -112,7 +112,7 @@
         <w:rPr/>
         <w:t xml:space="preserve">; </w:t>
       </w:r>
-      <w:hyperlink w:anchor="bm10">
+      <w:hyperlink w:anchor="bm7">
         <w:r>
           <w:rPr>
             <w:rStyle w:val="Hyperlink"/>
@@ -134,7 +134,7 @@
         <w:rPr/>
         <w:t>Duis aute irure dolor in reprehenderit in voluptate velit esse cillum dolore eu fugiat nulla pariatur</w:t>
       </w:r>
-      <w:hyperlink w:anchor="bm9">
+      <w:hyperlink w:anchor="bm6">
         <w:r>
           <w:rPr>
             <w:rStyle w:val="Hyperlink"/>
@@ -727,7 +727,7 @@
                       <w:szCs w:val="24"/>
                       <w:lang w:val="en-US" w:eastAsia="en-US" w:bidi="ar-SA"/>
                     </w:rPr>
-                    <w:t>reprehenderit</w:t>
+                    <w:t>in</w:t>
                   </w:r>
                 </w:p>
               </w:tc>
@@ -903,7 +903,7 @@
                       <w:szCs w:val="24"/>
                       <w:lang w:val="en-US" w:eastAsia="en-US" w:bidi="ar-SA"/>
                     </w:rPr>
-                    <w:t>voluptate</w:t>
+                    <w:t>in</w:t>
                   </w:r>
                 </w:p>
               </w:tc>
@@ -990,7 +990,7 @@
                       <w:szCs w:val="24"/>
                       <w:lang w:val="en-US" w:eastAsia="en-US" w:bidi="ar-SA"/>
                     </w:rPr>
-                    <w:t>velit</w:t>
+                    <w:t>in</w:t>
                   </w:r>
                 </w:p>
               </w:tc>
@@ -1077,7 +1077,7 @@
                       <w:szCs w:val="24"/>
                       <w:lang w:val="en-US" w:eastAsia="en-US" w:bidi="ar-SA"/>
                     </w:rPr>
-                    <w:t>esse</w:t>
+                    <w:t>reprehenderit</w:t>
                   </w:r>
                 </w:p>
               </w:tc>
@@ -1164,7 +1164,7 @@
                       <w:szCs w:val="24"/>
                       <w:lang w:val="en-US" w:eastAsia="en-US" w:bidi="ar-SA"/>
                     </w:rPr>
-                    <w:t>cillum</w:t>
+                    <w:t>in</w:t>
                   </w:r>
                 </w:p>
               </w:tc>
@@ -1251,7 +1251,7 @@
                       <w:szCs w:val="24"/>
                       <w:lang w:val="en-US" w:eastAsia="en-US" w:bidi="ar-SA"/>
                     </w:rPr>
-                    <w:t>dolore</w:t>
+                    <w:t>voluptate</w:t>
                   </w:r>
                 </w:p>
               </w:tc>
@@ -1340,7 +1340,7 @@
                     </w:rPr>
                     <w:t>eu</w:t>
                   </w:r>
-                  <w:bookmarkStart w:id="2" w:name="bm16"/>
+                  <w:bookmarkStart w:id="2" w:name="bm4"/>
                   <w:bookmarkEnd w:id="2"/>
                 </w:p>
               </w:tc>
@@ -1426,7 +1426,7 @@
                 <w:szCs w:val="24"/>
                 <w:lang w:val="en-US" w:eastAsia="en-US" w:bidi="ar-SA"/>
               </w:rPr>
-              <w:t>Fugiat nulla pariatur excepteur sint occaecat cupidatat non proident sunt in culpa qui officia deserunt mollit anim.</w:t>
+              <w:t>Velit esse cillum dolore eu fugiat nulla pariatur excepteur sint occaecat cupidatat non proident sunt in culpa.</w:t>
             </w:r>
           </w:p>
           <w:tbl>
@@ -1511,7 +1511,7 @@
                       <w:szCs w:val="24"/>
                       <w:lang w:val="en-US" w:eastAsia="en-US" w:bidi="ar-SA"/>
                     </w:rPr>
-                    <w:t>Est</w:t>
+                    <w:t>Qui</w:t>
                   </w:r>
                 </w:p>
               </w:tc>
@@ -1542,7 +1542,7 @@
                       <w:szCs w:val="24"/>
                       <w:lang w:val="en-US" w:eastAsia="en-US" w:bidi="ar-SA"/>
                     </w:rPr>
-                    <w:t>laborum</w:t>
+                    <w:t>officia</w:t>
                   </w:r>
                 </w:p>
               </w:tc>
@@ -1570,7 +1570,7 @@
                       <w:szCs w:val="24"/>
                       <w:lang w:val="en-US" w:eastAsia="en-US" w:bidi="ar-SA"/>
                     </w:rPr>
-                    <w:t>lorem</w:t>
+                    <w:t>deserunt</w:t>
                   </w:r>
                 </w:p>
               </w:tc>
@@ -1601,7 +1601,7 @@
                       <w:szCs w:val="24"/>
                       <w:lang w:val="en-US" w:eastAsia="en-US" w:bidi="ar-SA"/>
                     </w:rPr>
-                    <w:t>ipsum</w:t>
+                    <w:t>id</w:t>
                   </w:r>
                 </w:p>
               </w:tc>
@@ -1629,7 +1629,7 @@
                       <w:szCs w:val="24"/>
                       <w:lang w:val="en-US" w:eastAsia="en-US" w:bidi="ar-SA"/>
                     </w:rPr>
-                    <w:t>dolor</w:t>
+                    <w:t>mollit</w:t>
                   </w:r>
                 </w:p>
               </w:tc>
@@ -1660,7 +1660,7 @@
                       <w:szCs w:val="24"/>
                       <w:lang w:val="en-US" w:eastAsia="en-US" w:bidi="ar-SA"/>
                     </w:rPr>
-                    <w:t>sit</w:t>
+                    <w:t>anim</w:t>
                   </w:r>
                 </w:p>
               </w:tc>
@@ -1688,7 +1688,7 @@
                       <w:szCs w:val="24"/>
                       <w:lang w:val="en-US" w:eastAsia="en-US" w:bidi="ar-SA"/>
                     </w:rPr>
-                    <w:t>amet</w:t>
+                    <w:t>id</w:t>
                   </w:r>
                 </w:p>
               </w:tc>
@@ -1719,7 +1719,7 @@
                       <w:szCs w:val="24"/>
                       <w:lang w:val="en-US" w:eastAsia="en-US" w:bidi="ar-SA"/>
                     </w:rPr>
-                    <w:t>consectetur</w:t>
+                    <w:t>est</w:t>
                   </w:r>
                 </w:p>
               </w:tc>
@@ -1747,7 +1747,7 @@
                       <w:szCs w:val="24"/>
                       <w:lang w:val="en-US" w:eastAsia="en-US" w:bidi="ar-SA"/>
                     </w:rPr>
-                    <w:t>adipiscing</w:t>
+                    <w:t>laborum</w:t>
                   </w:r>
                 </w:p>
               </w:tc>
@@ -1778,7 +1778,7 @@
                       <w:szCs w:val="24"/>
                       <w:lang w:val="en-US" w:eastAsia="en-US" w:bidi="ar-SA"/>
                     </w:rPr>
-                    <w:t>elit</w:t>
+                    <w:t>lorem</w:t>
                   </w:r>
                 </w:p>
               </w:tc>
@@ -1806,9 +1806,9 @@
                       <w:szCs w:val="24"/>
                       <w:lang w:val="en-US" w:eastAsia="en-US" w:bidi="ar-SA"/>
                     </w:rPr>
-                    <w:t>sed</w:t>
-                  </w:r>
-                  <w:bookmarkStart w:id="3" w:name="bm15"/>
+                    <w:t>ipsum</w:t>
+                  </w:r>
+                  <w:bookmarkStart w:id="3" w:name="bm3"/>
                   <w:bookmarkEnd w:id="3"/>
                 </w:p>
               </w:tc>
@@ -1847,7 +1847,7 @@
       <w:bookmarkEnd w:id="1"/>
       <w:r>
         <w:rPr/>
-        <w:t>do eiusmod tempor incididunt ut labore</w:t>
+        <w:t>dolor sit amet consectetur adipiscing elit</w:t>
       </w:r>
     </w:p>
     <w:p>
@@ -1857,7 +1857,7 @@
       </w:pPr>
       <w:r>
         <w:rPr/>
-        <w:t>Et dolore magna aliqua ut enim ad minim veniam quis nostrud exercitation ullamco laboris nisi ut aliquip ex ea commodo consequat duis aute irure dolor in.</w:t>
+        <w:t>Sed do eiusmod tempor incididunt ut labore et dolore magna aliqua ut enim ad minim veniam quis nostrud exercitation ullamco laboris nisi ut aliquip ex ea.</w:t>
       </w:r>
     </w:p>
     <w:p>
@@ -1867,7 +1867,7 @@
       </w:pPr>
       <w:r>
         <w:rPr/>
-        <w:t>Reprehenderit in voluptate velit esse cillum dolore</w:t>
+        <w:t>Commodo consequat duis aute irure dolor in</w:t>
       </w:r>
       <w:r>
         <w:rPr>
@@ -1878,7 +1878,7 @@
       </w:r>
       <w:r>
         <w:rPr/>
-        <w:t>eu fugiat nulla pariatur excepteur sint occaecat cupidatat non proident sunt in culpa qui officia deserunt mollit anim id est laborum lorem ipsum dolor sit amet consectetur adipiscing elit sed do eiusmod tempor incididunt ut labore et dolore magna aliqua ut enim ad minim veniam quis nostrud exercitation ullamco laboris nisi ut aliquip ex ea commodo.</w:t>
+        <w:t>reprehenderit in voluptate velit esse cillum dolore eu fugiat nulla pariatur excepteur sint occaecat cupidatat non proident sunt in culpa qui officia deserunt mollit anim id est laborum lorem ipsum dolor sit amet consectetur adipiscing elit sed do eiusmod tempor incididunt ut labore et dolore magna aliqua ut enim ad minim veniam quis nostrud exercitation ullamco.</w:t>
       </w:r>
     </w:p>
     <w:p>
@@ -1888,7 +1888,7 @@
       </w:pPr>
       <w:r>
         <w:rPr/>
-        <w:t>Consequat duis aute irure dolor in reprehenderit in voluptate velit esse cillum dolore eu fugiat nulla pariatur excepteur sint occaecat cupidatat non proident sunt in culpa qui officia deserunt mollit anim id est laborum lorem ipsum dolor sit amet consectetur adipiscing elit sed do eiusmod tempor incididunt ut labore et dolore magna aliqua ut enim ad minim veniam quis nostrud exercitation ullamco laboris nisi ut aliquip ex ea commodo consequat duis aute irure dolor in reprehenderit in voluptate velit esse cillum dolore eu fugiat nulla.</w:t>
+        <w:t>Laboris nisi ut aliquip ex ea commodo consequat duis aute irure dolor in reprehenderit in voluptate velit esse cillum dolore eu fugiat nulla pariatur excepteur sint occaecat cupidatat non proident sunt in culpa qui officia deserunt mollit anim id est laborum lorem ipsum dolor sit amet consectetur adipiscing elit sed do eiusmod tempor incididunt ut labore et dolore magna aliqua ut enim ad minim veniam quis nostrud exercitation ullamco laboris nisi ut aliquip ex ea commodo consequat duis aute irure dolor in reprehenderit in voluptate.</w:t>
       </w:r>
     </w:p>
     <w:p>
@@ -1896,10 +1896,10 @@
         <w:pStyle w:val="Heading2"/>
         <w:rPr/>
       </w:pPr>
-      <w:bookmarkStart w:id="4" w:name="bm3"/>
-      <w:r>
-        <w:rPr/>
-        <w:t>pariatur excepteur sint</w:t>
+      <w:bookmarkStart w:id="4" w:name="bm5"/>
+      <w:r>
+        <w:rPr/>
+        <w:t>velit esse cillum</w:t>
       </w:r>
     </w:p>
     <w:p>
@@ -1912,11 +1912,11 @@
           <w:b/>
           <w:bCs/>
         </w:rPr>
-        <w:t>Occaecat cupidatat non proident sunt in culpa.</w:t>
-      </w:r>
-      <w:r>
-        <w:rPr/>
-        <w:t>Qui officia deserunt mollit anim id est laborum lorem ipsum dolor sit amet consectetur adipiscing elit sed do eiusmod tempor incididunt ut labore et dolore magna aliqua ut enim ad minim veniam quis nostrud exercitation ullamco laboris nisi ut aliquip ex ea commodo consequat duis aute irure dolor in reprehenderit in voluptate velit esse cillum dolore eu fugiat nulla pariatur excepteur sint occaecat cupidatat non proident sunt</w:t>
+        <w:t>Dolore eu fugiat nulla pariatur excepteur sint.</w:t>
+      </w:r>
+      <w:r>
+        <w:rPr/>
+        <w:t>Occaecat cupidatat non proident sunt in culpa qui officia deserunt mollit anim id est laborum lorem ipsum dolor sit amet consectetur adipiscing elit sed do eiusmod tempor incididunt ut labore et dolore magna aliqua ut enim ad minim veniam quis nostrud exercitation ullamco laboris nisi ut aliquip ex ea commodo consequat duis aute irure dolor in reprehenderit in voluptate velit esse cillum dolore eu fugiat nulla pariatur</w:t>
       </w:r>
       <w:r>
         <w:rPr>
@@ -1927,7 +1927,7 @@
       </w:r>
       <w:r>
         <w:rPr/>
-        <w:t>in culpa qui officia deserunt mollit anim id est laborum lorem ipsum dolor sit amet consectetur adipiscing elit sed do eiusmod tempor incididunt ut labore et dolore magna aliqua ut enim ad minim veniam quis nostrud exercitation ullamco laboris nisi ut aliquip ex ea commodo consequat duis aute irure dolor in reprehenderit in voluptate velit esse cillum dolore eu.</w:t>
+        <w:t>excepteur sint occaecat cupidatat non proident sunt in culpa qui officia deserunt mollit anim id est laborum lorem ipsum dolor sit amet consectetur adipiscing elit sed do eiusmod tempor incididunt ut labore et dolore magna aliqua ut enim ad minim veniam quis nostrud exercitation ullamco laboris nisi ut aliquip ex ea commodo consequat duis aute irure dolor in reprehenderit.</w:t>
       </w:r>
     </w:p>
     <w:p>
@@ -1940,11 +1940,11 @@
           <w:b/>
           <w:bCs/>
         </w:rPr>
-        <w:t>Fugiat nulla pariatur excepteur sint occaecat cupidatat non proident.</w:t>
-      </w:r>
-      <w:r>
-        <w:rPr/>
-        <w:t>Sunt in culpa qui officia deserunt mollit anim id est laborum lorem ipsum dolor sit amet consectetur adipiscing elit sed do eiusmod tempor incididunt ut labore et dolore magna aliqua</w:t>
+        <w:t>In voluptate velit esse cillum dolore eu fugiat nulla.</w:t>
+      </w:r>
+      <w:r>
+        <w:rPr/>
+        <w:t>Pariatur excepteur sint occaecat cupidatat non proident sunt in culpa qui officia deserunt mollit anim id est laborum lorem ipsum dolor sit amet consectetur adipiscing elit sed do eiusmod tempor</w:t>
       </w:r>
       <w:r>
         <w:rPr>
@@ -1955,7 +1955,7 @@
       </w:r>
       <w:r>
         <w:rPr/>
-        <w:t>ut enim ad minim veniam quis nostrud exercitation ullamco laboris nisi ut aliquip ex ea commodo consequat duis aute irure dolor in reprehenderit in voluptate velit esse cillum dolore eu fugiat nulla pariatur excepteur sint occaecat cupidatat non proident sunt in culpa qui officia deserunt mollit anim id est laborum lorem ipsum dolor sit amet consectetur adipiscing elit sed do eiusmod tempor incididunt ut labore et dolore magna aliqua ut enim ad minim.</w:t>
+        <w:t>incididunt ut labore et dolore magna aliqua ut enim ad minim veniam quis nostrud exercitation ullamco laboris nisi ut aliquip ex ea commodo consequat duis aute irure dolor in reprehenderit in voluptate velit esse cillum dolore eu fugiat nulla pariatur excepteur sint occaecat cupidatat non proident sunt in culpa qui officia deserunt mollit anim id est laborum lorem ipsum dolor sit amet consectetur adipiscing elit sed do eiusmod tempor incididunt ut labore et.</w:t>
       </w:r>
     </w:p>
     <w:p>
@@ -1963,11 +1963,11 @@
         <w:pStyle w:val="Heading2"/>
         <w:rPr/>
       </w:pPr>
-      <w:bookmarkStart w:id="5" w:name="bm4"/>
+      <w:bookmarkStart w:id="5" w:name="bm6"/>
       <w:bookmarkEnd w:id="4"/>
       <w:r>
         <w:rPr/>
-        <w:t>veniam quis nostrud exercitation ullamco laboris nisi</w:t>
+        <w:t>dolore magna aliqua ut enim ad minim</w:t>
       </w:r>
     </w:p>
     <w:p>
@@ -1977,7 +1977,7 @@
       </w:pPr>
       <w:r>
         <w:rPr/>
-        <w:t>Ut aliquip ex ea commodo consequat duis aute irure dolor in reprehenderit in voluptate velit esse cillum dolore eu fugiat nulla pariatur excepteur sint.</w:t>
+        <w:t>Veniam quis nostrud exercitation ullamco laboris nisi ut aliquip ex ea commodo consequat duis aute irure dolor in reprehenderit in voluptate velit esse cillum.</w:t>
       </w:r>
     </w:p>
     <w:p>
@@ -1987,7 +1987,7 @@
       </w:pPr>
       <w:r>
         <w:rPr/>
-        <w:t>Occaecat cupidatat non proident sunt in culpa qui officia deserunt mollit anim id est laborum lorem ipsum dolor sit amet consectetur adipiscing elit sed do eiusmod tempor incididunt ut labore et dolore magnaaliqua ut enim ad minim veniam quis nostrud exercitation ullamco laboris nisi ut aliquip ex ea commodo consequat duis aute irure dolor in reprehenderit in voluptate velit esse cillum dolore eu fugiat nulla pariatur excepteur sint occaecat cupidatat non proident sunt in culpa qui officia deserunt mollit anim id est laborum lorem ipsum dolor sit amet consectetur adipiscing elit sed do eiusmod tempor incididunt ut labore et dolore magna aliqua ut enim ad minim veniam quis nostrud exercitation ullamco laboris nisi ut aliquip ex ea commodo consequat duis aute irure dolor in reprehenderit in voluptate velit esse cillum.</w:t>
+        <w:t>Dolore eu fugiat nulla pariatur excepteur sint occaecat cupidatat non proident sunt in culpa qui officia deserunt mollit anim id est laborum lorem ipsum dolor sit amet consectetur adipiscing elit sed do eiusmod tempor incididunt ut labore et dolore magna aliqua ut enim ad minim veniam quis nostrud exercitation ullamco laboris nisi ut aliquip ex ea commodo consequat duis aute irure dolor in reprehenderit in voluptate velit esse cillum dolore eu fugiat nulla pariatur excepteur sint occaecat cupidatat non proident sunt in culpa qui officia deserunt mollit anim id est laborum lorem ipsum dolor sit amet consectetur adipiscing elit sed do eiusmod tempor incididunt ut labore et dolore magna aliqua ut enim ad minim veniam quis nostrud exercitation ullamco laboris nisi ut aliquip ex ea commodo consequat duis aute irure.</w:t>
       </w:r>
     </w:p>
     <w:p>
@@ -1995,11 +1995,11 @@
         <w:pStyle w:val="Heading2"/>
         <w:rPr/>
       </w:pPr>
-      <w:bookmarkStart w:id="6" w:name="bm5"/>
+      <w:bookmarkStart w:id="6" w:name="bm7"/>
       <w:bookmarkEnd w:id="5"/>
       <w:r>
         <w:rPr/>
-        <w:t>Dolore</w:t>
+        <w:t>In</w:t>
       </w:r>
     </w:p>
     <w:p>
@@ -2009,7 +2009,7 @@
       </w:pPr>
       <w:r>
         <w:rPr/>
-        <w:t>Eu fugiat nulla pariatur excepteur sint occaecat cupidatat non proident sunt in culpa qui officia deserunt mollit anim</w:t>
+        <w:t>Dolor in reprehenderit in voluptate velit esse cillum dolore eu fugiat nulla pariatur excepteur sint occaecat cupidatat non</w:t>
       </w:r>
       <w:r>
         <w:rPr>
@@ -2067,7 +2067,7 @@
                 <w:szCs w:val="24"/>
                 <w:lang w:val="en-US" w:eastAsia="en-US" w:bidi="ar-SA"/>
               </w:rPr>
-              <w:t>Est laborum lorem ipsum dolor sit amet consectetur adipiscing elit.</w:t>
+              <w:t>Proident sunt in culpa qui officia deserunt mollit anim id.</w:t>
             </w:r>
           </w:p>
           <w:tbl>
@@ -2122,7 +2122,7 @@
                       <w:szCs w:val="24"/>
                       <w:lang w:val="en-US" w:eastAsia="en-US" w:bidi="ar-SA"/>
                     </w:rPr>
-                    <w:t>Sed</w:t>
+                    <w:t>Est</w:t>
                   </w:r>
                 </w:p>
               </w:tc>
@@ -2184,7 +2184,7 @@
                       <w:szCs w:val="24"/>
                       <w:lang w:val="en-US" w:eastAsia="en-US" w:bidi="ar-SA"/>
                     </w:rPr>
-                    <w:t>Eiusmod tempor incididunt</w:t>
+                    <w:t>Laborum lorem ipsum</w:t>
                   </w:r>
                 </w:p>
               </w:tc>
@@ -2215,7 +2215,7 @@
                       <w:szCs w:val="24"/>
                       <w:lang w:val="en-US" w:eastAsia="en-US" w:bidi="ar-SA"/>
                     </w:rPr>
-                    <w:t>Ut labore et dolore magna</w:t>
+                    <w:t>Dolor sit amet consectetur adipiscing</w:t>
                   </w:r>
                 </w:p>
               </w:tc>
@@ -2243,7 +2243,7 @@
                       <w:szCs w:val="24"/>
                       <w:lang w:val="en-US" w:eastAsia="en-US" w:bidi="ar-SA"/>
                     </w:rPr>
-                    <w:t>aliqua ut</w:t>
+                    <w:t>elit sed</w:t>
                   </w:r>
                 </w:p>
               </w:tc>
@@ -2271,7 +2271,7 @@
                       <w:szCs w:val="24"/>
                       <w:lang w:val="en-US" w:eastAsia="en-US" w:bidi="ar-SA"/>
                     </w:rPr>
-                    <w:t>Enim ad minim veniam quis nostrud exercitation ullamco laboris nisi ut aliquip ex</w:t>
+                    <w:t>Do eiusmod tempor incididunt ut labore et dolore magna aliqua ut enim ad</w:t>
                   </w:r>
                 </w:p>
               </w:tc>
@@ -2302,7 +2302,7 @@
                       <w:szCs w:val="24"/>
                       <w:lang w:val="en-US" w:eastAsia="en-US" w:bidi="ar-SA"/>
                     </w:rPr>
-                    <w:t>Ea commodo consequat</w:t>
+                    <w:t>Minim veniam quis</w:t>
                   </w:r>
                 </w:p>
               </w:tc>
@@ -2330,7 +2330,7 @@
                       <w:szCs w:val="24"/>
                       <w:lang w:val="en-US" w:eastAsia="en-US" w:bidi="ar-SA"/>
                     </w:rPr>
-                    <w:t>duis aute</w:t>
+                    <w:t>nostrud exercitation</w:t>
                   </w:r>
                 </w:p>
               </w:tc>
@@ -2358,7 +2358,7 @@
                       <w:szCs w:val="24"/>
                       <w:lang w:val="en-US" w:eastAsia="en-US" w:bidi="ar-SA"/>
                     </w:rPr>
-                    <w:t>Irure dolor in reprehenderit in voluptate velit esse cillum dolore eu fugiat nulla</w:t>
+                    <w:t>Ullamco laboris nisi ut aliquip ex ea commodo consequat duis aute irure dolor</w:t>
                   </w:r>
                 </w:p>
               </w:tc>
@@ -2389,7 +2389,7 @@
                       <w:szCs w:val="24"/>
                       <w:lang w:val="en-US" w:eastAsia="en-US" w:bidi="ar-SA"/>
                     </w:rPr>
-                    <w:t>Pariatur excepteur sint</w:t>
+                    <w:t>In reprehenderit in</w:t>
                   </w:r>
                 </w:p>
               </w:tc>
@@ -2417,7 +2417,7 @@
                       <w:szCs w:val="24"/>
                       <w:lang w:val="en-US" w:eastAsia="en-US" w:bidi="ar-SA"/>
                     </w:rPr>
-                    <w:t>occaecat cupidatat non proident sunt</w:t>
+                    <w:t>voluptate velit esse cillum dolore</w:t>
                   </w:r>
                 </w:p>
               </w:tc>
@@ -2445,7 +2445,7 @@
                       <w:szCs w:val="24"/>
                       <w:lang w:val="en-US" w:eastAsia="en-US" w:bidi="ar-SA"/>
                     </w:rPr>
-                    <w:t>In culpa qui officia deserunt mollit anim id est laborum lorem</w:t>
+                    <w:t>Eu fugiat nulla pariatur excepteur sint occaecat cupidatat non proident sunt</w:t>
                   </w:r>
                 </w:p>
               </w:tc>
@@ -2476,7 +2476,7 @@
                       <w:szCs w:val="24"/>
                       <w:lang w:val="en-US" w:eastAsia="en-US" w:bidi="ar-SA"/>
                     </w:rPr>
-                    <w:t>Ipsum dolor sit</w:t>
+                    <w:t>In culpa qui</w:t>
                   </w:r>
                 </w:p>
               </w:tc>
@@ -2504,7 +2504,7 @@
                       <w:szCs w:val="24"/>
                       <w:lang w:val="en-US" w:eastAsia="en-US" w:bidi="ar-SA"/>
                     </w:rPr>
-                    <w:t>amet consectetur adipiscing</w:t>
+                    <w:t>officia deserunt mollit</w:t>
                   </w:r>
                 </w:p>
               </w:tc>
@@ -2532,7 +2532,7 @@
                       <w:szCs w:val="24"/>
                       <w:lang w:val="en-US" w:eastAsia="en-US" w:bidi="ar-SA"/>
                     </w:rPr>
-                    <w:t>Elit sed do eiusmod tempor incididunt ut</w:t>
+                    <w:t>Anim id est laborum lorem ipsum dolor</w:t>
                   </w:r>
                 </w:p>
               </w:tc>
@@ -2563,7 +2563,7 @@
                       <w:szCs w:val="24"/>
                       <w:lang w:val="en-US" w:eastAsia="en-US" w:bidi="ar-SA"/>
                     </w:rPr>
-                    <w:t>Labore et dolore magna</w:t>
+                    <w:t>Sit amet consectetur adipiscing</w:t>
                   </w:r>
                 </w:p>
               </w:tc>
@@ -2619,7 +2619,7 @@
                       <w:szCs w:val="24"/>
                       <w:lang w:val="en-US" w:eastAsia="en-US" w:bidi="ar-SA"/>
                     </w:rPr>
-                    <w:t>Aliqua ut</w:t>
+                    <w:t>Elit sed</w:t>
                   </w:r>
                 </w:p>
               </w:tc>
@@ -2650,7 +2650,7 @@
                       <w:szCs w:val="24"/>
                       <w:lang w:val="en-US" w:eastAsia="en-US" w:bidi="ar-SA"/>
                     </w:rPr>
-                    <w:t>Enim ad</w:t>
+                    <w:t>Do eiusmod</w:t>
                   </w:r>
                 </w:p>
               </w:tc>
@@ -2706,7 +2706,7 @@
                       <w:szCs w:val="24"/>
                       <w:lang w:val="en-US" w:eastAsia="en-US" w:bidi="ar-SA"/>
                     </w:rPr>
-                    <w:t>minim veniam quis</w:t>
+                    <w:t>tempor incididunt ut</w:t>
                   </w:r>
                 </w:p>
               </w:tc>
@@ -2737,7 +2737,7 @@
                       <w:szCs w:val="24"/>
                       <w:lang w:val="en-US" w:eastAsia="en-US" w:bidi="ar-SA"/>
                     </w:rPr>
-                    <w:t>Nostrud exercitation ullamco</w:t>
+                    <w:t>Labore et dolore</w:t>
                   </w:r>
                 </w:p>
               </w:tc>
@@ -2765,7 +2765,7 @@
                       <w:szCs w:val="24"/>
                       <w:lang w:val="en-US" w:eastAsia="en-US" w:bidi="ar-SA"/>
                     </w:rPr>
-                    <w:t>laboris nisi</w:t>
+                    <w:t>magna aliqua</w:t>
                   </w:r>
                 </w:p>
               </w:tc>
@@ -2793,7 +2793,7 @@
                       <w:szCs w:val="24"/>
                       <w:lang w:val="en-US" w:eastAsia="en-US" w:bidi="ar-SA"/>
                     </w:rPr>
-                    <w:t>Ut aliquip ex ea</w:t>
+                    <w:t>Ut enim ad minim</w:t>
                   </w:r>
                 </w:p>
               </w:tc>
@@ -2824,7 +2824,7 @@
                       <w:szCs w:val="24"/>
                       <w:lang w:val="en-US" w:eastAsia="en-US" w:bidi="ar-SA"/>
                     </w:rPr>
-                    <w:t>Commodo consequat</w:t>
+                    <w:t>Veniam quis</w:t>
                   </w:r>
                 </w:p>
               </w:tc>
@@ -2852,7 +2852,7 @@
                       <w:szCs w:val="24"/>
                       <w:lang w:val="en-US" w:eastAsia="en-US" w:bidi="ar-SA"/>
                     </w:rPr>
-                    <w:t>duis</w:t>
+                    <w:t>nostrud</w:t>
                   </w:r>
                 </w:p>
               </w:tc>
@@ -2880,7 +2880,7 @@
                       <w:szCs w:val="24"/>
                       <w:lang w:val="en-US" w:eastAsia="en-US" w:bidi="ar-SA"/>
                     </w:rPr>
-                    <w:t>Aute irure dolor in</w:t>
+                    <w:t>Exercitation ullamco laboris nisi</w:t>
                   </w:r>
                 </w:p>
               </w:tc>
@@ -2911,7 +2911,7 @@
                       <w:szCs w:val="24"/>
                       <w:lang w:val="en-US" w:eastAsia="en-US" w:bidi="ar-SA"/>
                     </w:rPr>
-                    <w:t>Reprehenderit in</w:t>
+                    <w:t>Ut aliquip</w:t>
                   </w:r>
                 </w:p>
               </w:tc>
@@ -2939,7 +2939,7 @@
                       <w:szCs w:val="24"/>
                       <w:lang w:val="en-US" w:eastAsia="en-US" w:bidi="ar-SA"/>
                     </w:rPr>
-                    <w:t>voluptate</w:t>
+                    <w:t>ex</w:t>
                   </w:r>
                 </w:p>
               </w:tc>
@@ -2967,7 +2967,7 @@
                       <w:szCs w:val="24"/>
                       <w:lang w:val="en-US" w:eastAsia="en-US" w:bidi="ar-SA"/>
                     </w:rPr>
-                    <w:t>Velit esse cillum dolore eu fugiat nulla</w:t>
+                    <w:t>Ea commodo consequat duis aute irure dolor</w:t>
                   </w:r>
                 </w:p>
               </w:tc>
@@ -2998,7 +2998,7 @@
                       <w:szCs w:val="24"/>
                       <w:lang w:val="en-US" w:eastAsia="en-US" w:bidi="ar-SA"/>
                     </w:rPr>
-                    <w:t>Pariatur excepteur</w:t>
+                    <w:t>In reprehenderit</w:t>
                   </w:r>
                 </w:p>
               </w:tc>
@@ -3054,7 +3054,7 @@
                       <w:szCs w:val="24"/>
                       <w:lang w:val="en-US" w:eastAsia="en-US" w:bidi="ar-SA"/>
                     </w:rPr>
-                    <w:t>sint occaecat cupidatat non proident sunt in</w:t>
+                    <w:t>in voluptate velit esse cillum dolore eu</w:t>
                   </w:r>
                 </w:p>
               </w:tc>
@@ -3085,7 +3085,7 @@
                       <w:szCs w:val="24"/>
                       <w:lang w:val="en-US" w:eastAsia="en-US" w:bidi="ar-SA"/>
                     </w:rPr>
-                    <w:t>Culpa qui officia</w:t>
+                    <w:t>Fugiat nulla pariatur</w:t>
                   </w:r>
                 </w:p>
               </w:tc>
@@ -3141,7 +3141,7 @@
                       <w:szCs w:val="24"/>
                       <w:lang w:val="en-US" w:eastAsia="en-US" w:bidi="ar-SA"/>
                     </w:rPr>
-                    <w:t>deserunt mollit anim id est</w:t>
+                    <w:t>excepteur sint occaecat cupidatat non</w:t>
                   </w:r>
                 </w:p>
               </w:tc>
@@ -3172,7 +3172,7 @@
                       <w:szCs w:val="24"/>
                       <w:lang w:val="en-US" w:eastAsia="en-US" w:bidi="ar-SA"/>
                     </w:rPr>
-                    <w:t>Laborum lorem</w:t>
+                    <w:t>Proident sunt</w:t>
                   </w:r>
                 </w:p>
               </w:tc>
@@ -3200,7 +3200,7 @@
                       <w:szCs w:val="24"/>
                       <w:lang w:val="en-US" w:eastAsia="en-US" w:bidi="ar-SA"/>
                     </w:rPr>
-                    <w:t>ipsum</w:t>
+                    <w:t>in</w:t>
                   </w:r>
                 </w:p>
               </w:tc>
@@ -3228,9 +3228,9 @@
                       <w:szCs w:val="24"/>
                       <w:lang w:val="en-US" w:eastAsia="en-US" w:bidi="ar-SA"/>
                     </w:rPr>
-                    <w:t>Dolor sit amet consectetur adipiscing elit</w:t>
-                  </w:r>
-                  <w:bookmarkStart w:id="7" w:name="bm14"/>
+                    <w:t>Culpa qui officia deserunt mollit anim</w:t>
+                  </w:r>
+                  <w:bookmarkStart w:id="7" w:name="bm7"/>
                   <w:bookmarkEnd w:id="7"/>
                 </w:p>
               </w:tc>
@@ -3269,7 +3269,7 @@
       <w:bookmarkEnd w:id="6"/>
       <w:r>
         <w:rPr/>
-        <w:t>Sed</w:t>
+        <w:t>Id</w:t>
       </w:r>
     </w:p>
     <w:p>
@@ -3277,18 +3277,18 @@
         <w:pStyle w:val="Bibliography"/>
         <w:rPr/>
       </w:pPr>
-      <w:bookmarkStart w:id="8" w:name="bm12"/>
-      <w:bookmarkStart w:id="9" w:name="bm6"/>
-      <w:r>
-        <w:rPr/>
-        <w:t>Do eiusmod tempor incididunt ut labore et dolore magna aliqua ut enim ad minim veniam quis nostrud exercitation ullamco laboris nisi ut aliquip ex ea commodo consequat duis aute irure dolor in reprehenderit in voluptate velit esse.</w:t>
+      <w:bookmarkStart w:id="8" w:name="bm5"/>
+      <w:bookmarkStart w:id="9" w:name="bm3"/>
+      <w:r>
+        <w:rPr/>
+        <w:t>Est laborum lorem ipsum dolor sit amet consectetur adipiscing elit sed do eiusmod tempor incididunt ut labore et dolore magna aliqua ut enim ad minim veniam quis nostrud exercitation ullamco laboris nisi ut aliquip ex ea commodo.</w:t>
       </w:r>
       <w:r>
         <w:rPr>
           <w:i/>
           <w:iCs/>
         </w:rPr>
-        <w:t>Cillum dolore</w:t>
+        <w:t>Consequat duis</w:t>
       </w:r>
       <w:r>
         <w:rPr/>
@@ -3303,14 +3303,14 @@
       </w:r>
       <w:r>
         <w:rPr/>
-        <w:t>eu fugiat.</w:t>
-      </w:r>
-      <w:hyperlink r:id="rId2">
+        <w:t>aute irure.</w:t>
+      </w:r>
+      <w:hyperlink r:id="rIdRefLink1">
         <w:r>
           <w:rPr>
             <w:rStyle w:val="Hyperlink"/>
           </w:rPr>
-          <w:t>nulla</w:t>
+          <w:t>dolor</w:t>
         </w:r>
       </w:hyperlink>
     </w:p>
@@ -3319,22 +3319,22 @@
         <w:pStyle w:val="Bibliography"/>
         <w:rPr/>
       </w:pPr>
-      <w:bookmarkStart w:id="10" w:name="bm7"/>
+      <w:bookmarkStart w:id="10" w:name="bm4"/>
       <w:bookmarkEnd w:id="9"/>
       <w:r>
         <w:rPr/>
-        <w:t>Pariatur excepteur sint.</w:t>
+        <w:t>In reprehenderit in.</w:t>
       </w:r>
       <w:r>
         <w:rPr>
           <w:i/>
           <w:iCs/>
         </w:rPr>
-        <w:t>Occaecat cupidatat non proident sunt in culpa</w:t>
-      </w:r>
-      <w:r>
-        <w:rPr/>
-        <w:t>qui officia deserunt mollit anim.</w:t>
+        <w:t>Voluptate velit esse cillum dolore eu fugiat</w:t>
+      </w:r>
+      <w:r>
+        <w:rPr/>
+        <w:t>nulla pariatur excepteur sint occaecat.</w:t>
       </w:r>
     </w:p>
     <w:p>
@@ -3342,29 +3342,29 @@
         <w:pStyle w:val="Bibliography"/>
         <w:rPr/>
       </w:pPr>
-      <w:bookmarkStart w:id="11" w:name="bm8"/>
+      <w:bookmarkStart w:id="11" w:name="bm5"/>
       <w:bookmarkEnd w:id="10"/>
       <w:r>
         <w:rPr/>
-        <w:t>Id est laborum lorem ipsum dolor sit amet consectetur adipiscing elit sed do eiusmod tempor incididunt ut labore et dolore magna aliqua ut enim ad minim veniam quis nostrud exercitation ullamco laboris.</w:t>
+        <w:t>Cupidatat non proident sunt in culpa qui officia deserunt mollit anim id est laborum lorem ipsum dolor sit amet consectetur adipiscing elit sed do eiusmod tempor incididunt ut labore et dolore magna.</w:t>
       </w:r>
       <w:r>
         <w:rPr>
           <w:i/>
           <w:iCs/>
         </w:rPr>
-        <w:t>Nisi ut</w:t>
+        <w:t>Aliqua ut</w:t>
       </w:r>
       <w:r>
         <w:rPr/>
         <w:t xml:space="preserve">. </w:t>
       </w:r>
-      <w:hyperlink r:id="rId3">
+      <w:hyperlink r:id="rIdRefLink2">
         <w:r>
           <w:rPr>
             <w:rStyle w:val="Hyperlink"/>
           </w:rPr>
-          <w:t>aliquip</w:t>
+          <w:t>enim</w:t>
         </w:r>
       </w:hyperlink>
     </w:p>
@@ -3373,18 +3373,18 @@
         <w:pStyle w:val="Bibliography"/>
         <w:rPr/>
       </w:pPr>
-      <w:bookmarkStart w:id="12" w:name="bm9"/>
+      <w:bookmarkStart w:id="12" w:name="bm6"/>
       <w:bookmarkEnd w:id="11"/>
       <w:r>
         <w:rPr/>
-        <w:t>Ex ea commodo consequat duis aute irure dolor in reprehenderit in voluptate velit esse cillum dolore eu.</w:t>
+        <w:t>Ad minim veniam quis nostrud exercitation ullamco laboris nisi ut aliquip ex ea commodo consequat duis aute.</w:t>
       </w:r>
       <w:r>
         <w:rPr>
           <w:i/>
           <w:iCs/>
         </w:rPr>
-        <w:t>Fugiat nulla pariatur</w:t>
+        <w:t>Irure dolor in</w:t>
       </w:r>
       <w:r>
         <w:rPr/>
@@ -3399,14 +3399,14 @@
       </w:r>
       <w:r>
         <w:rPr/>
-        <w:t>excepteur sint.</w:t>
-      </w:r>
-      <w:hyperlink r:id="rId4">
+        <w:t>reprehenderit in.</w:t>
+      </w:r>
+      <w:hyperlink r:id="rIdRefLink3">
         <w:r>
           <w:rPr>
             <w:rStyle w:val="Hyperlink"/>
           </w:rPr>
-          <w:t>occaecat</w:t>
+          <w:t>voluptate</w:t>
         </w:r>
       </w:hyperlink>
     </w:p>
@@ -3416,18 +3416,18 @@
         <w:spacing w:before="100" w:after="100"/>
         <w:rPr/>
       </w:pPr>
-      <w:bookmarkStart w:id="13" w:name="bm10"/>
+      <w:bookmarkStart w:id="13" w:name="bm7"/>
       <w:bookmarkEnd w:id="12"/>
       <w:r>
         <w:rPr/>
-        <w:t>Cupidatat non proident sunt in culpa qui officia deserunt mollit anim id est laborum lorem ipsum dolor sit amet consectetur adipiscing elit sed do eiusmod tempor incididunt ut labore et dolore magna aliqua ut.</w:t>
+        <w:t>Velit esse cillum dolore eu fugiat nulla pariatur excepteur sint occaecat cupidatat non proident sunt in culpa qui officia deserunt mollit anim id est laborum lorem ipsum dolor sit amet consectetur adipiscing elit sed.</w:t>
       </w:r>
       <w:r>
         <w:rPr>
           <w:i/>
           <w:iCs/>
         </w:rPr>
-        <w:t>Enim ad minim veniam</w:t>
+        <w:t>Do eiusmod tempor incididunt</w:t>
       </w:r>
       <w:r>
         <w:rPr/>
@@ -3442,14 +3442,14 @@
       </w:r>
       <w:r>
         <w:rPr/>
-        <w:t>quis nostrud.</w:t>
-      </w:r>
-      <w:hyperlink r:id="rId5">
+        <w:t>ut labore.</w:t>
+      </w:r>
+      <w:hyperlink r:id="rIdRefLink4">
         <w:r>
           <w:rPr>
             <w:rStyle w:val="Hyperlink"/>
           </w:rPr>
-          <w:t>exercitation</w:t>
+          <w:t>ut</w:t>
         </w:r>
       </w:hyperlink>
       <w:bookmarkEnd w:id="0"/>
@@ -3457,38 +3457,59 @@
       <w:bookmarkEnd w:id="13"/>
     </w:p>
     <w:sectPr>
-      <w:footerReference w:type="even" r:id="rId6"/>
-      <w:footerReference w:type="default" r:id="rId7"/>
-      <w:footerReference w:type="first" r:id="rId8"/>
-      <w:type w:val="nextPage"/>
+      <w:footerReference w:type="even" r:id="rId12"/>
+      <w:footerReference w:type="default" r:id="rId13"/>
+      <w:footerReference w:type="first" r:id="rId14"/>
       <w:pgSz w:w="12240" w:h="15840"/>
-      <w:pgMar w:left="950" w:right="950" w:gutter="0" w:header="0" w:top="950" w:footer="720" w:bottom="950"/>
-      <w:pgNumType w:fmt="decimal"/>
-      <w:formProt w:val="false"/>
-      <w:textDirection w:val="lrTb"/>
-      <w:docGrid w:type="default" w:linePitch="100" w:charSpace="0"/>
+      <w:pgMar w:top="950" w:right="950" w:bottom="950" w:left="950" w:header="0" w:footer="720" w:gutter="0"/>
+      <w:cols w:space="720"/>
+      <w:formProt w:val="0"/>
+      <w:docGrid w:linePitch="100"/>
     </w:sectPr>
   </w:body>
 </w:document>
 </file>
 
+<file path=word/endnotes.xml><?xml version="1.0" encoding="utf-8"?>
+<w:endnotes xmlns:wpc="http://schemas.microsoft.com/office/word/2010/wordprocessingCanvas" xmlns:cx="http://schemas.microsoft.com/office/drawing/2014/chartex" xmlns:cx1="http://schemas.microsoft.com/office/drawing/2015/9/8/chartex" xmlns:cx2="http://schemas.microsoft.com/office/drawing/2015/10/21/chartex" xmlns:cx3="http://schemas.microsoft.com/office/drawing/2016/5/9/chartex" xmlns:cx4="http://schemas.microsoft.com/office/drawing/2016/5/10/chartex" xmlns:cx5="http://schemas.microsoft.com/office/drawing/2016/5/11/chartex" xmlns:cx6="http://schemas.microsoft.com/office/drawing/2016/5/12/chartex" xmlns:cx7="http://schemas.microsoft.com/office/drawing/2016/5/13/chartex" xmlns:cx8="http://schemas.microsoft.com/office/drawing/2016/5/14/chartex" xmlns:mc="http://schemas.openxmlformats.org/markup-compatibility/2006" xmlns:m="http://schemas.openxmlformats.org/officeDocument/2006/math" xmlns:aink="http://schemas.microsoft.com/office/drawing/2016/ink" xmlns:am3d="http://schemas.microsoft.com/office/drawing/2017/model3d" xmlns:oel="http://schemas.microsoft.com/office/2019/extlst" xmlns:r="http://schemas.openxmlformats.org/officeDocument/2006/relationships" xmlns:wp14="http://schemas.microsoft.com/office/word/2010/wordprocessingDrawing" xmlns:wp="http://schemas.openxmlformats.org/drawingml/2006/wordprocessingDrawing" xmlns:wpg="http://schemas.microsoft.com/office/word/2010/wordprocessingGroup" xmlns:wpi="http://schemas.microsoft.com/office/word/2010/wordprocessingInk" xmlns:wps="http://schemas.microsoft.com/office/word/2010/wordprocessingShape" xmlns:o="urn:schemas-microsoft-com:office:office" xmlns:v="urn:schemas-microsoft-com:vml" xmlns:w10="urn:schemas-microsoft-com:office:word" xmlns:w="http://schemas.openxmlformats.org/wordprocessingml/2006/main" xmlns:w14="http://schemas.microsoft.com/office/word/2010/wordml" xmlns:w15="http://schemas.microsoft.com/office/word/2012/wordml" xmlns:w16cex="http://schemas.microsoft.com/office/word/2018/wordml/cex" xmlns:w16cid="http://schemas.microsoft.com/office/word/2016/wordml/cid" xmlns:w16="http://schemas.microsoft.com/office/word/2018/wordml" xmlns:w16sdtdh="http://schemas.microsoft.com/office/word/2020/wordml/sdtdatahash" xmlns:w16sdtfl="http://schemas.microsoft.com/office/word/2024/wordml/sdtformatlock" xmlns:w16se="http://schemas.microsoft.com/office/word/2015/wordml/symex" xmlns:w16du="http://schemas.microsoft.com/office/word/2023/wordml/word16du" xmlns:wne="http://schemas.microsoft.com/office/word/2006/wordml" mc:Ignorable="w14 w15 w16se w16cid w16 w16cex w16sdtdh w16sdtfl w16du wp14">
+  <w:endnote w:type="separator" w:id="-1">
+    <w:p>
+      <w:pPr>
+        <w:spacing w:before="0" w:after="0"/>
+      </w:pPr>
+      <w:r>
+        <w:separator/>
+      </w:r>
+    </w:p>
+  </w:endnote>
+  <w:endnote w:type="continuationSeparator" w:id="0">
+    <w:p>
+      <w:pPr>
+        <w:spacing w:before="0" w:after="0"/>
+      </w:pPr>
+      <w:r>
+        <w:continuationSeparator/>
+      </w:r>
+    </w:p>
+  </w:endnote>
+</w:endnotes>
+</file>
+
 <file path=word/footer1.xml><?xml version="1.0" encoding="utf-8"?>
-<w:ftr xmlns:o="urn:schemas-microsoft-com:office:office" xmlns:r="http://schemas.openxmlformats.org/officeDocument/2006/relationships" xmlns:v="urn:schemas-microsoft-com:vml" xmlns:w="http://schemas.openxmlformats.org/wordprocessingml/2006/main" xmlns:w10="urn:schemas-microsoft-com:office:word" xmlns:wp="http://schemas.openxmlformats.org/drawingml/2006/wordprocessingDrawing" xmlns:pic="http://schemas.openxmlformats.org/drawingml/2006/picture" xmlns:wps="http://schemas.microsoft.com/office/word/2010/wordprocessingShape" xmlns:wpg="http://schemas.microsoft.com/office/word/2010/wordprocessingGroup" xmlns:mc="http://schemas.openxmlformats.org/markup-compatibility/2006" xmlns:wp14="http://schemas.microsoft.com/office/word/2010/wordprocessingDrawing" xmlns:w14="http://schemas.microsoft.com/office/word/2010/wordml" xmlns:w15="http://schemas.microsoft.com/office/word/2012/wordml" mc:Ignorable="w14 wp14 w15">
+<w:ftr xmlns:wpc="http://schemas.microsoft.com/office/word/2010/wordprocessingCanvas" xmlns:cx="http://schemas.microsoft.com/office/drawing/2014/chartex" xmlns:cx1="http://schemas.microsoft.com/office/drawing/2015/9/8/chartex" xmlns:cx2="http://schemas.microsoft.com/office/drawing/2015/10/21/chartex" xmlns:cx3="http://schemas.microsoft.com/office/drawing/2016/5/9/chartex" xmlns:cx4="http://schemas.microsoft.com/office/drawing/2016/5/10/chartex" xmlns:cx5="http://schemas.microsoft.com/office/drawing/2016/5/11/chartex" xmlns:cx6="http://schemas.microsoft.com/office/drawing/2016/5/12/chartex" xmlns:cx7="http://schemas.microsoft.com/office/drawing/2016/5/13/chartex" xmlns:cx8="http://schemas.microsoft.com/office/drawing/2016/5/14/chartex" xmlns:mc="http://schemas.openxmlformats.org/markup-compatibility/2006" xmlns:m="http://schemas.openxmlformats.org/officeDocument/2006/math" xmlns:aink="http://schemas.microsoft.com/office/drawing/2016/ink" xmlns:am3d="http://schemas.microsoft.com/office/drawing/2017/model3d" xmlns:oel="http://schemas.microsoft.com/office/2019/extlst" xmlns:r="http://schemas.openxmlformats.org/officeDocument/2006/relationships" xmlns:wp14="http://schemas.microsoft.com/office/word/2010/wordprocessingDrawing" xmlns:wp="http://schemas.openxmlformats.org/drawingml/2006/wordprocessingDrawing" xmlns:wpg="http://schemas.microsoft.com/office/word/2010/wordprocessingGroup" xmlns:wpi="http://schemas.microsoft.com/office/word/2010/wordprocessingInk" xmlns:wps="http://schemas.microsoft.com/office/word/2010/wordprocessingShape" xmlns:o="urn:schemas-microsoft-com:office:office" xmlns:v="urn:schemas-microsoft-com:vml" xmlns:w10="urn:schemas-microsoft-com:office:word" xmlns:w="http://schemas.openxmlformats.org/wordprocessingml/2006/main" xmlns:w14="http://schemas.microsoft.com/office/word/2010/wordml" xmlns:w15="http://schemas.microsoft.com/office/word/2012/wordml" xmlns:w16cex="http://schemas.microsoft.com/office/word/2018/wordml/cex" xmlns:w16cid="http://schemas.microsoft.com/office/word/2016/wordml/cid" xmlns:w16="http://schemas.microsoft.com/office/word/2018/wordml" xmlns:w16sdtdh="http://schemas.microsoft.com/office/word/2020/wordml/sdtdatahash" xmlns:w16sdtfl="http://schemas.microsoft.com/office/word/2024/wordml/sdtformatlock" xmlns:w16se="http://schemas.microsoft.com/office/word/2015/wordml/symex" xmlns:w16du="http://schemas.microsoft.com/office/word/2023/wordml/word16du" xmlns:wne="http://schemas.microsoft.com/office/word/2006/wordml" mc:Ignorable="w14 w15 w16se w16cid w16 w16cex w16sdtdh w16sdtfl w16du wp14">
   <w:p>
     <w:pPr>
       <w:pStyle w:val="Footer"/>
-      <w:spacing w:before="100" w:after="0"/>
-      <w:ind w:end="360"/>
-      <w:rPr/>
+      <w:ind w:right="360"/>
     </w:pPr>
     <w:r>
-      <w:rPr/>
-    </w:r>
-    <w:r>
+      <w:rPr>
+        <w:noProof/>
+      </w:rPr>
       <mc:AlternateContent>
         <mc:Choice Requires="wps">
           <w:drawing>
-            <wp:anchor distT="0" distB="0" distL="0" distR="0" simplePos="0" relativeHeight="0" behindDoc="0" locked="0" layoutInCell="1" allowOverlap="1">
+            <wp:anchor distT="0" distB="0" distL="0" distR="0" simplePos="0" relativeHeight="251658752" behindDoc="1" locked="0" layoutInCell="0" allowOverlap="1" wp14:anchorId="3366B5E8" wp14:editId="065D4B91">
               <wp:simplePos x="0" y="0"/>
               <wp:positionH relativeFrom="margin">
                 <wp:align>right</wp:align>
@@ -3499,23 +3520,37 @@
               <wp:extent cx="14605" cy="14605"/>
               <wp:effectExtent l="0" t="0" r="0" b="0"/>
               <wp:wrapNone/>
-              <wp:docPr id="1" name="Frame1"/>
+              <wp:docPr id="6" name="Frame1"/>
+              <wp:cNvGraphicFramePr/>
               <a:graphic xmlns:a="http://schemas.openxmlformats.org/drawingml/2006/main">
                 <a:graphicData uri="http://schemas.microsoft.com/office/word/2010/wordprocessingShape">
                   <wps:wsp>
-                    <wps:cNvSpPr txBox="1"/>
+                    <wps:cNvSpPr/>
                     <wps:spPr>
                       <a:xfrm>
                         <a:off x="0" y="0"/>
-                        <a:ext cx="14605" cy="14605"/>
+                        <a:ext cx="14760" cy="14760"/>
                       </a:xfrm>
-                      <a:prstGeom prst="rect"/>
-                      <a:solidFill>
-                        <a:srgbClr val="FFFFFF">
-                          <a:alpha val="0"/>
-                        </a:srgbClr>
-                      </a:solidFill>
+                      <a:prstGeom prst="rect">
+                        <a:avLst/>
+                      </a:prstGeom>
+                      <a:noFill/>
+                      <a:ln w="0">
+                        <a:noFill/>
+                      </a:ln>
                     </wps:spPr>
+                    <wps:style>
+                      <a:lnRef idx="0">
+                        <a:scrgbClr r="0" g="0" b="0"/>
+                      </a:lnRef>
+                      <a:fillRef idx="0">
+                        <a:scrgbClr r="0" g="0" b="0"/>
+                      </a:fillRef>
+                      <a:effectRef idx="0">
+                        <a:scrgbClr r="0" g="0" b="0"/>
+                      </a:effectRef>
+                      <a:fontRef idx="minor"/>
+                    </wps:style>
                     <wps:txbx>
                       <w:txbxContent>
                         <w:sdt>
@@ -3523,15 +3558,13 @@
                             <w:id w:val="-1797213190"/>
                             <w:docPartObj>
                               <w:docPartGallery w:val="Page Numbers (Bottom of Page)"/>
-                              <w:docPartUnique w:val="true"/>
+                              <w:docPartUnique/>
                             </w:docPartObj>
                           </w:sdtPr>
                           <w:sdtContent>
                             <w:p>
                               <w:pPr>
                                 <w:pStyle w:val="Footer"/>
-                                <w:pBdr/>
-                                <w:spacing w:before="100" w:after="0"/>
                                 <w:rPr>
                                   <w:rStyle w:val="PageNumber"/>
                                 </w:rPr>
@@ -3571,7 +3604,7 @@
                         </w:sdt>
                       </w:txbxContent>
                     </wps:txbx>
-                    <wps:bodyPr anchor="t" lIns="0" tIns="0" rIns="0" bIns="0">
+                    <wps:bodyPr lIns="0" tIns="0" rIns="0" bIns="0" anchor="t">
                       <a:spAutoFit/>
                     </wps:bodyPr>
                   </wps:wsp>
@@ -3582,24 +3615,21 @@
         </mc:Choice>
         <mc:Fallback>
           <w:pict>
-            <v:rect fillcolor="#FFFFFF" style="position:absolute;rotation:-0;width:1.15pt;height:1.15pt;mso-wrap-distance-left:0pt;mso-wrap-distance-right:0pt;mso-wrap-distance-top:0pt;mso-wrap-distance-bottom:0pt;margin-top:0.05pt;mso-position-vertical-relative:text;margin-left:0pt;mso-position-horizontal:right;mso-position-horizontal-relative:margin">
-              <v:fill opacity="0f"/>
-              <v:textbox inset="0in,0in,0in,0in">
+            <v:rect w14:anchorId="3366B5E8" id="Frame1" o:spid="_x0000_s1026" style="position:absolute;margin-left:-50.05pt;margin-top:.05pt;width:1.15pt;height:1.15pt;z-index:-251657728;visibility:visible;mso-wrap-style:square;mso-wrap-distance-left:0;mso-wrap-distance-top:0;mso-wrap-distance-right:0;mso-wrap-distance-bottom:0;mso-position-horizontal:right;mso-position-horizontal-relative:margin;mso-position-vertical:absolute;mso-position-vertical-relative:text;v-text-anchor:top" o:gfxdata="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" o:allowincell="f" filled="f" stroked="f" strokeweight="0">
+              <v:textbox style="mso-fit-shape-to-text:t" inset="0,0,0,0">
                 <w:txbxContent>
                   <w:sdt>
                     <w:sdtPr>
                       <w:id w:val="-1797213190"/>
                       <w:docPartObj>
                         <w:docPartGallery w:val="Page Numbers (Bottom of Page)"/>
-                        <w:docPartUnique w:val="true"/>
+                        <w:docPartUnique/>
                       </w:docPartObj>
                     </w:sdtPr>
                     <w:sdtContent>
                       <w:p>
                         <w:pPr>
                           <w:pStyle w:val="Footer"/>
-                          <w:pBdr/>
-                          <w:spacing w:before="100" w:after="0"/>
                           <w:rPr>
                             <w:rStyle w:val="PageNumber"/>
                           </w:rPr>
@@ -3639,7 +3669,7 @@
                   </w:sdt>
                 </w:txbxContent>
               </v:textbox>
-              <w10:wrap type="none"/>
+              <w10:wrap anchorx="margin"/>
             </v:rect>
           </w:pict>
         </mc:Fallback>
@@ -3650,22 +3680,20 @@
 </file>
 
 <file path=word/footer2.xml><?xml version="1.0" encoding="utf-8"?>
-<w:ftr xmlns:o="urn:schemas-microsoft-com:office:office" xmlns:r="http://schemas.openxmlformats.org/officeDocument/2006/relationships" xmlns:v="urn:schemas-microsoft-com:vml" xmlns:w="http://schemas.openxmlformats.org/wordprocessingml/2006/main" xmlns:w10="urn:schemas-microsoft-com:office:word" xmlns:wp="http://schemas.openxmlformats.org/drawingml/2006/wordprocessingDrawing" xmlns:pic="http://schemas.openxmlformats.org/drawingml/2006/picture" xmlns:wps="http://schemas.microsoft.com/office/word/2010/wordprocessingShape" xmlns:wpg="http://schemas.microsoft.com/office/word/2010/wordprocessingGroup" xmlns:mc="http://schemas.openxmlformats.org/markup-compatibility/2006" xmlns:wp14="http://schemas.microsoft.com/office/word/2010/wordprocessingDrawing" xmlns:w14="http://schemas.microsoft.com/office/word/2010/wordml" xmlns:w15="http://schemas.microsoft.com/office/word/2012/wordml" mc:Ignorable="w14 wp14 w15">
+<w:ftr xmlns:wpc="http://schemas.microsoft.com/office/word/2010/wordprocessingCanvas" xmlns:cx="http://schemas.microsoft.com/office/drawing/2014/chartex" xmlns:cx1="http://schemas.microsoft.com/office/drawing/2015/9/8/chartex" xmlns:cx2="http://schemas.microsoft.com/office/drawing/2015/10/21/chartex" xmlns:cx3="http://schemas.microsoft.com/office/drawing/2016/5/9/chartex" xmlns:cx4="http://schemas.microsoft.com/office/drawing/2016/5/10/chartex" xmlns:cx5="http://schemas.microsoft.com/office/drawing/2016/5/11/chartex" xmlns:cx6="http://schemas.microsoft.com/office/drawing/2016/5/12/chartex" xmlns:cx7="http://schemas.microsoft.com/office/drawing/2016/5/13/chartex" xmlns:cx8="http://schemas.microsoft.com/office/drawing/2016/5/14/chartex" xmlns:mc="http://schemas.openxmlformats.org/markup-compatibility/2006" xmlns:m="http://schemas.openxmlformats.org/officeDocument/2006/math" xmlns:aink="http://schemas.microsoft.com/office/drawing/2016/ink" xmlns:am3d="http://schemas.microsoft.com/office/drawing/2017/model3d" xmlns:oel="http://schemas.microsoft.com/office/2019/extlst" xmlns:r="http://schemas.openxmlformats.org/officeDocument/2006/relationships" xmlns:wp14="http://schemas.microsoft.com/office/word/2010/wordprocessingDrawing" xmlns:wp="http://schemas.openxmlformats.org/drawingml/2006/wordprocessingDrawing" xmlns:wpg="http://schemas.microsoft.com/office/word/2010/wordprocessingGroup" xmlns:wpi="http://schemas.microsoft.com/office/word/2010/wordprocessingInk" xmlns:wps="http://schemas.microsoft.com/office/word/2010/wordprocessingShape" xmlns:o="urn:schemas-microsoft-com:office:office" xmlns:v="urn:schemas-microsoft-com:vml" xmlns:w10="urn:schemas-microsoft-com:office:word" xmlns:w="http://schemas.openxmlformats.org/wordprocessingml/2006/main" xmlns:w14="http://schemas.microsoft.com/office/word/2010/wordml" xmlns:w15="http://schemas.microsoft.com/office/word/2012/wordml" xmlns:w16cex="http://schemas.microsoft.com/office/word/2018/wordml/cex" xmlns:w16cid="http://schemas.microsoft.com/office/word/2016/wordml/cid" xmlns:w16="http://schemas.microsoft.com/office/word/2018/wordml" xmlns:w16sdtdh="http://schemas.microsoft.com/office/word/2020/wordml/sdtdatahash" xmlns:w16sdtfl="http://schemas.microsoft.com/office/word/2024/wordml/sdtformatlock" xmlns:w16se="http://schemas.microsoft.com/office/word/2015/wordml/symex" xmlns:w16du="http://schemas.microsoft.com/office/word/2023/wordml/word16du" xmlns:wne="http://schemas.microsoft.com/office/word/2006/wordml" mc:Ignorable="w14 w15 w16se w16cid w16 w16cex w16sdtdh w16sdtfl w16du wp14">
   <w:p>
     <w:pPr>
       <w:pStyle w:val="Footer"/>
-      <w:spacing w:before="100" w:after="0"/>
-      <w:ind w:end="360"/>
-      <w:rPr/>
+      <w:ind w:right="360"/>
     </w:pPr>
     <w:r>
-      <w:rPr/>
-    </w:r>
-    <w:r>
+      <w:rPr>
+        <w:noProof/>
+      </w:rPr>
       <mc:AlternateContent>
         <mc:Choice Requires="wps">
           <w:drawing>
-            <wp:anchor distT="0" distB="0" distL="0" distR="0" simplePos="0" relativeHeight="4" behindDoc="0" locked="0" layoutInCell="0" allowOverlap="1">
+            <wp:anchor distT="0" distB="0" distL="0" distR="0" simplePos="0" relativeHeight="251656704" behindDoc="1" locked="0" layoutInCell="0" allowOverlap="1" wp14:anchorId="4428BBB0" wp14:editId="69B529C0">
               <wp:simplePos x="0" y="0"/>
               <wp:positionH relativeFrom="margin">
                 <wp:align>right</wp:align>
@@ -3676,23 +3704,37 @@
               <wp:extent cx="77470" cy="227330"/>
               <wp:effectExtent l="0" t="0" r="0" b="0"/>
               <wp:wrapNone/>
-              <wp:docPr id="2" name="Frame2"/>
+              <wp:docPr id="7" name="Frame2"/>
+              <wp:cNvGraphicFramePr/>
               <a:graphic xmlns:a="http://schemas.openxmlformats.org/drawingml/2006/main">
                 <a:graphicData uri="http://schemas.microsoft.com/office/word/2010/wordprocessingShape">
                   <wps:wsp>
-                    <wps:cNvSpPr txBox="1"/>
+                    <wps:cNvSpPr/>
                     <wps:spPr>
                       <a:xfrm>
                         <a:off x="0" y="0"/>
-                        <a:ext cx="77470" cy="227330"/>
+                        <a:ext cx="77400" cy="227160"/>
                       </a:xfrm>
-                      <a:prstGeom prst="rect"/>
-                      <a:solidFill>
-                        <a:srgbClr val="FFFFFF">
-                          <a:alpha val="0"/>
-                        </a:srgbClr>
-                      </a:solidFill>
+                      <a:prstGeom prst="rect">
+                        <a:avLst/>
+                      </a:prstGeom>
+                      <a:noFill/>
+                      <a:ln w="0">
+                        <a:noFill/>
+                      </a:ln>
                     </wps:spPr>
+                    <wps:style>
+                      <a:lnRef idx="0">
+                        <a:scrgbClr r="0" g="0" b="0"/>
+                      </a:lnRef>
+                      <a:fillRef idx="0">
+                        <a:scrgbClr r="0" g="0" b="0"/>
+                      </a:fillRef>
+                      <a:effectRef idx="0">
+                        <a:scrgbClr r="0" g="0" b="0"/>
+                      </a:effectRef>
+                      <a:fontRef idx="minor"/>
+                    </wps:style>
                     <wps:txbx>
                       <w:txbxContent>
                         <w:sdt>
@@ -3700,15 +3742,13 @@
                             <w:id w:val="895854564"/>
                             <w:docPartObj>
                               <w:docPartGallery w:val="Page Numbers (Bottom of Page)"/>
-                              <w:docPartUnique w:val="true"/>
+                              <w:docPartUnique/>
                             </w:docPartObj>
                           </w:sdtPr>
                           <w:sdtContent>
                             <w:p>
                               <w:pPr>
                                 <w:pStyle w:val="Footer"/>
-                                <w:pBdr/>
-                                <w:spacing w:before="100" w:after="0"/>
                                 <w:rPr>
                                   <w:rStyle w:val="PageNumber"/>
                                 </w:rPr>
@@ -3735,7 +3775,7 @@
                                 <w:rPr>
                                   <w:rStyle w:val="PageNumber"/>
                                 </w:rPr>
-                                <w:t>3</w:t>
+                                <w:t>38</w:t>
                               </w:r>
                               <w:r>
                                 <w:rPr>
@@ -3748,7 +3788,7 @@
                         </w:sdt>
                       </w:txbxContent>
                     </wps:txbx>
-                    <wps:bodyPr anchor="t" lIns="0" tIns="0" rIns="0" bIns="0">
+                    <wps:bodyPr lIns="0" tIns="0" rIns="0" bIns="0" anchor="t">
                       <a:spAutoFit/>
                     </wps:bodyPr>
                   </wps:wsp>
@@ -3759,24 +3799,21 @@
         </mc:Choice>
         <mc:Fallback>
           <w:pict>
-            <v:rect fillcolor="#FFFFFF" style="position:absolute;rotation:-0;width:6.1pt;height:17.9pt;mso-wrap-distance-left:0pt;mso-wrap-distance-right:0pt;mso-wrap-distance-top:0pt;mso-wrap-distance-bottom:0pt;margin-top:0.05pt;mso-position-vertical-relative:text;margin-left:510.9pt;mso-position-horizontal:right;mso-position-horizontal-relative:margin">
-              <v:fill opacity="0f"/>
-              <v:textbox inset="0in,0in,0in,0in">
+            <v:rect w14:anchorId="4428BBB0" id="Frame2" o:spid="_x0000_s1027" style="position:absolute;margin-left:-45.1pt;margin-top:.05pt;width:6.1pt;height:17.9pt;z-index:-251659776;visibility:visible;mso-wrap-style:square;mso-wrap-distance-left:0;mso-wrap-distance-top:0;mso-wrap-distance-right:0;mso-wrap-distance-bottom:0;mso-position-horizontal:right;mso-position-horizontal-relative:margin;mso-position-vertical:absolute;mso-position-vertical-relative:text;v-text-anchor:top" o:gfxdata="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" o:allowincell="f" filled="f" stroked="f" strokeweight="0">
+              <v:textbox style="mso-fit-shape-to-text:t" inset="0,0,0,0">
                 <w:txbxContent>
                   <w:sdt>
                     <w:sdtPr>
                       <w:id w:val="895854564"/>
                       <w:docPartObj>
                         <w:docPartGallery w:val="Page Numbers (Bottom of Page)"/>
-                        <w:docPartUnique w:val="true"/>
+                        <w:docPartUnique/>
                       </w:docPartObj>
                     </w:sdtPr>
                     <w:sdtContent>
                       <w:p>
                         <w:pPr>
                           <w:pStyle w:val="Footer"/>
-                          <w:pBdr/>
-                          <w:spacing w:before="100" w:after="0"/>
                           <w:rPr>
                             <w:rStyle w:val="PageNumber"/>
                           </w:rPr>
@@ -3803,7 +3840,7 @@
                           <w:rPr>
                             <w:rStyle w:val="PageNumber"/>
                           </w:rPr>
-                          <w:t>3</w:t>
+                          <w:t>38</w:t>
                         </w:r>
                         <w:r>
                           <w:rPr>
@@ -3816,7 +3853,7 @@
                   </w:sdt>
                 </w:txbxContent>
               </v:textbox>
-              <w10:wrap type="none"/>
+              <w10:wrap anchorx="margin"/>
             </v:rect>
           </w:pict>
         </mc:Fallback>
@@ -3827,22 +3864,20 @@
 </file>
 
 <file path=word/footer3.xml><?xml version="1.0" encoding="utf-8"?>
-<w:ftr xmlns:o="urn:schemas-microsoft-com:office:office" xmlns:r="http://schemas.openxmlformats.org/officeDocument/2006/relationships" xmlns:v="urn:schemas-microsoft-com:vml" xmlns:w="http://schemas.openxmlformats.org/wordprocessingml/2006/main" xmlns:w10="urn:schemas-microsoft-com:office:word" xmlns:wp="http://schemas.openxmlformats.org/drawingml/2006/wordprocessingDrawing" xmlns:pic="http://schemas.openxmlformats.org/drawingml/2006/picture" xmlns:wps="http://schemas.microsoft.com/office/word/2010/wordprocessingShape" xmlns:wpg="http://schemas.microsoft.com/office/word/2010/wordprocessingGroup" xmlns:mc="http://schemas.openxmlformats.org/markup-compatibility/2006" xmlns:wp14="http://schemas.microsoft.com/office/word/2010/wordprocessingDrawing" xmlns:w14="http://schemas.microsoft.com/office/word/2010/wordml" xmlns:w15="http://schemas.microsoft.com/office/word/2012/wordml" mc:Ignorable="w14 wp14 w15">
+<w:ftr xmlns:wpc="http://schemas.microsoft.com/office/word/2010/wordprocessingCanvas" xmlns:cx="http://schemas.microsoft.com/office/drawing/2014/chartex" xmlns:cx1="http://schemas.microsoft.com/office/drawing/2015/9/8/chartex" xmlns:cx2="http://schemas.microsoft.com/office/drawing/2015/10/21/chartex" xmlns:cx3="http://schemas.microsoft.com/office/drawing/2016/5/9/chartex" xmlns:cx4="http://schemas.microsoft.com/office/drawing/2016/5/10/chartex" xmlns:cx5="http://schemas.microsoft.com/office/drawing/2016/5/11/chartex" xmlns:cx6="http://schemas.microsoft.com/office/drawing/2016/5/12/chartex" xmlns:cx7="http://schemas.microsoft.com/office/drawing/2016/5/13/chartex" xmlns:cx8="http://schemas.microsoft.com/office/drawing/2016/5/14/chartex" xmlns:mc="http://schemas.openxmlformats.org/markup-compatibility/2006" xmlns:m="http://schemas.openxmlformats.org/officeDocument/2006/math" xmlns:aink="http://schemas.microsoft.com/office/drawing/2016/ink" xmlns:am3d="http://schemas.microsoft.com/office/drawing/2017/model3d" xmlns:oel="http://schemas.microsoft.com/office/2019/extlst" xmlns:r="http://schemas.openxmlformats.org/officeDocument/2006/relationships" xmlns:wp14="http://schemas.microsoft.com/office/word/2010/wordprocessingDrawing" xmlns:wp="http://schemas.openxmlformats.org/drawingml/2006/wordprocessingDrawing" xmlns:wpg="http://schemas.microsoft.com/office/word/2010/wordprocessingGroup" xmlns:wpi="http://schemas.microsoft.com/office/word/2010/wordprocessingInk" xmlns:wps="http://schemas.microsoft.com/office/word/2010/wordprocessingShape" xmlns:o="urn:schemas-microsoft-com:office:office" xmlns:v="urn:schemas-microsoft-com:vml" xmlns:w10="urn:schemas-microsoft-com:office:word" xmlns:w="http://schemas.openxmlformats.org/wordprocessingml/2006/main" xmlns:w14="http://schemas.microsoft.com/office/word/2010/wordml" xmlns:w15="http://schemas.microsoft.com/office/word/2012/wordml" xmlns:w16cex="http://schemas.microsoft.com/office/word/2018/wordml/cex" xmlns:w16cid="http://schemas.microsoft.com/office/word/2016/wordml/cid" xmlns:w16="http://schemas.microsoft.com/office/word/2018/wordml" xmlns:w16sdtdh="http://schemas.microsoft.com/office/word/2020/wordml/sdtdatahash" xmlns:w16sdtfl="http://schemas.microsoft.com/office/word/2024/wordml/sdtformatlock" xmlns:w16se="http://schemas.microsoft.com/office/word/2015/wordml/symex" xmlns:w16du="http://schemas.microsoft.com/office/word/2023/wordml/word16du" xmlns:wne="http://schemas.microsoft.com/office/word/2006/wordml" mc:Ignorable="w14 w15 w16se w16cid w16 w16cex w16sdtdh w16sdtfl w16du wp14">
   <w:p>
     <w:pPr>
       <w:pStyle w:val="Footer"/>
-      <w:spacing w:before="100" w:after="0"/>
-      <w:ind w:end="360"/>
-      <w:rPr/>
+      <w:ind w:right="360"/>
     </w:pPr>
     <w:r>
-      <w:rPr/>
-    </w:r>
-    <w:r>
+      <w:rPr>
+        <w:noProof/>
+      </w:rPr>
       <mc:AlternateContent>
         <mc:Choice Requires="wps">
           <w:drawing>
-            <wp:anchor distT="0" distB="0" distL="0" distR="0" simplePos="0" relativeHeight="4" behindDoc="0" locked="0" layoutInCell="0" allowOverlap="1">
+            <wp:anchor distT="0" distB="0" distL="0" distR="0" simplePos="0" relativeHeight="251657728" behindDoc="1" locked="0" layoutInCell="0" allowOverlap="1" wp14:anchorId="660F8A48" wp14:editId="7D38DCB2">
               <wp:simplePos x="0" y="0"/>
               <wp:positionH relativeFrom="margin">
                 <wp:align>right</wp:align>
@@ -3853,39 +3888,51 @@
               <wp:extent cx="77470" cy="227330"/>
               <wp:effectExtent l="0" t="0" r="0" b="0"/>
               <wp:wrapNone/>
-              <wp:docPr id="3" name="Frame2"/>
+              <wp:docPr id="8" name="Frame2"/>
+              <wp:cNvGraphicFramePr/>
               <a:graphic xmlns:a="http://schemas.openxmlformats.org/drawingml/2006/main">
                 <a:graphicData uri="http://schemas.microsoft.com/office/word/2010/wordprocessingShape">
                   <wps:wsp>
-                    <wps:cNvSpPr txBox="1"/>
+                    <wps:cNvSpPr/>
                     <wps:spPr>
                       <a:xfrm>
                         <a:off x="0" y="0"/>
-                        <a:ext cx="77470" cy="227330"/>
+                        <a:ext cx="77400" cy="227160"/>
                       </a:xfrm>
-                      <a:prstGeom prst="rect"/>
-                      <a:solidFill>
-                        <a:srgbClr val="FFFFFF">
-                          <a:alpha val="0"/>
-                        </a:srgbClr>
-                      </a:solidFill>
+                      <a:prstGeom prst="rect">
+                        <a:avLst/>
+                      </a:prstGeom>
+                      <a:noFill/>
+                      <a:ln w="0">
+                        <a:noFill/>
+                      </a:ln>
                     </wps:spPr>
+                    <wps:style>
+                      <a:lnRef idx="0">
+                        <a:scrgbClr r="0" g="0" b="0"/>
+                      </a:lnRef>
+                      <a:fillRef idx="0">
+                        <a:scrgbClr r="0" g="0" b="0"/>
+                      </a:fillRef>
+                      <a:effectRef idx="0">
+                        <a:scrgbClr r="0" g="0" b="0"/>
+                      </a:effectRef>
+                      <a:fontRef idx="minor"/>
+                    </wps:style>
                     <wps:txbx>
                       <w:txbxContent>
                         <w:sdt>
                           <w:sdtPr>
-                            <w:id w:val="895854564"/>
+                            <w:id w:val="985284130"/>
                             <w:docPartObj>
                               <w:docPartGallery w:val="Page Numbers (Bottom of Page)"/>
-                              <w:docPartUnique w:val="true"/>
+                              <w:docPartUnique/>
                             </w:docPartObj>
                           </w:sdtPr>
                           <w:sdtContent>
                             <w:p>
                               <w:pPr>
                                 <w:pStyle w:val="Footer"/>
-                                <w:pBdr/>
-                                <w:spacing w:before="100" w:after="0"/>
                                 <w:rPr>
                                   <w:rStyle w:val="PageNumber"/>
                                 </w:rPr>
@@ -3912,7 +3959,7 @@
                                 <w:rPr>
                                   <w:rStyle w:val="PageNumber"/>
                                 </w:rPr>
-                                <w:t>3</w:t>
+                                <w:t>38</w:t>
                               </w:r>
                               <w:r>
                                 <w:rPr>
@@ -3925,7 +3972,7 @@
                         </w:sdt>
                       </w:txbxContent>
                     </wps:txbx>
-                    <wps:bodyPr anchor="t" lIns="0" tIns="0" rIns="0" bIns="0">
+                    <wps:bodyPr lIns="0" tIns="0" rIns="0" bIns="0" anchor="t">
                       <a:spAutoFit/>
                     </wps:bodyPr>
                   </wps:wsp>
@@ -3936,24 +3983,21 @@
         </mc:Choice>
         <mc:Fallback>
           <w:pict>
-            <v:rect fillcolor="#FFFFFF" style="position:absolute;rotation:-0;width:6.1pt;height:17.9pt;mso-wrap-distance-left:0pt;mso-wrap-distance-right:0pt;mso-wrap-distance-top:0pt;mso-wrap-distance-bottom:0pt;margin-top:0.05pt;mso-position-vertical-relative:text;margin-left:510.9pt;mso-position-horizontal:right;mso-position-horizontal-relative:margin">
-              <v:fill opacity="0f"/>
-              <v:textbox inset="0in,0in,0in,0in">
+            <v:rect w14:anchorId="660F8A48" id="_x0000_s1028" style="position:absolute;margin-left:-45.1pt;margin-top:.05pt;width:6.1pt;height:17.9pt;z-index:-251658752;visibility:visible;mso-wrap-style:square;mso-wrap-distance-left:0;mso-wrap-distance-top:0;mso-wrap-distance-right:0;mso-wrap-distance-bottom:0;mso-position-horizontal:right;mso-position-horizontal-relative:margin;mso-position-vertical:absolute;mso-position-vertical-relative:text;v-text-anchor:top" o:gfxdata="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" o:allowincell="f" filled="f" stroked="f" strokeweight="0">
+              <v:textbox style="mso-fit-shape-to-text:t" inset="0,0,0,0">
                 <w:txbxContent>
                   <w:sdt>
                     <w:sdtPr>
-                      <w:id w:val="895854564"/>
+                      <w:id w:val="985284130"/>
                       <w:docPartObj>
                         <w:docPartGallery w:val="Page Numbers (Bottom of Page)"/>
-                        <w:docPartUnique w:val="true"/>
+                        <w:docPartUnique/>
                       </w:docPartObj>
                     </w:sdtPr>
                     <w:sdtContent>
                       <w:p>
                         <w:pPr>
                           <w:pStyle w:val="Footer"/>
-                          <w:pBdr/>
-                          <w:spacing w:before="100" w:after="0"/>
                           <w:rPr>
                             <w:rStyle w:val="PageNumber"/>
                           </w:rPr>
@@ -3980,7 +4024,7 @@
                           <w:rPr>
                             <w:rStyle w:val="PageNumber"/>
                           </w:rPr>
-                          <w:t>3</w:t>
+                          <w:t>38</w:t>
                         </w:r>
                         <w:r>
                           <w:rPr>
@@ -3993,7 +4037,7 @@
                   </w:sdt>
                 </w:txbxContent>
               </v:textbox>
-              <w10:wrap type="none"/>
+              <w10:wrap anchorx="margin"/>
             </v:rect>
           </w:pict>
         </mc:Fallback>
@@ -4003,12 +4047,435 @@
 </w:ftr>
 </file>
 
+<file path=word/footnotes.xml><?xml version="1.0" encoding="utf-8"?>
+<w:footnotes xmlns:wpc="http://schemas.microsoft.com/office/word/2010/wordprocessingCanvas" xmlns:cx="http://schemas.microsoft.com/office/drawing/2014/chartex" xmlns:cx1="http://schemas.microsoft.com/office/drawing/2015/9/8/chartex" xmlns:cx2="http://schemas.microsoft.com/office/drawing/2015/10/21/chartex" xmlns:cx3="http://schemas.microsoft.com/office/drawing/2016/5/9/chartex" xmlns:cx4="http://schemas.microsoft.com/office/drawing/2016/5/10/chartex" xmlns:cx5="http://schemas.microsoft.com/office/drawing/2016/5/11/chartex" xmlns:cx6="http://schemas.microsoft.com/office/drawing/2016/5/12/chartex" xmlns:cx7="http://schemas.microsoft.com/office/drawing/2016/5/13/chartex" xmlns:cx8="http://schemas.microsoft.com/office/drawing/2016/5/14/chartex" xmlns:mc="http://schemas.openxmlformats.org/markup-compatibility/2006" xmlns:m="http://schemas.openxmlformats.org/officeDocument/2006/math" xmlns:aink="http://schemas.microsoft.com/office/drawing/2016/ink" xmlns:am3d="http://schemas.microsoft.com/office/drawing/2017/model3d" xmlns:oel="http://schemas.microsoft.com/office/2019/extlst" xmlns:r="http://schemas.openxmlformats.org/officeDocument/2006/relationships" xmlns:wp14="http://schemas.microsoft.com/office/word/2010/wordprocessingDrawing" xmlns:wp="http://schemas.openxmlformats.org/drawingml/2006/wordprocessingDrawing" xmlns:wpg="http://schemas.microsoft.com/office/word/2010/wordprocessingGroup" xmlns:wpi="http://schemas.microsoft.com/office/word/2010/wordprocessingInk" xmlns:wps="http://schemas.microsoft.com/office/word/2010/wordprocessingShape" xmlns:o="urn:schemas-microsoft-com:office:office" xmlns:v="urn:schemas-microsoft-com:vml" xmlns:w10="urn:schemas-microsoft-com:office:word" xmlns:w="http://schemas.openxmlformats.org/wordprocessingml/2006/main" xmlns:w14="http://schemas.microsoft.com/office/word/2010/wordml" xmlns:w15="http://schemas.microsoft.com/office/word/2012/wordml" xmlns:w16cex="http://schemas.microsoft.com/office/word/2018/wordml/cex" xmlns:w16cid="http://schemas.microsoft.com/office/word/2016/wordml/cid" xmlns:w16="http://schemas.microsoft.com/office/word/2018/wordml" xmlns:w16sdtdh="http://schemas.microsoft.com/office/word/2020/wordml/sdtdatahash" xmlns:w16sdtfl="http://schemas.microsoft.com/office/word/2024/wordml/sdtformatlock" xmlns:w16se="http://schemas.microsoft.com/office/word/2015/wordml/symex" xmlns:w16du="http://schemas.microsoft.com/office/word/2023/wordml/word16du" xmlns:wne="http://schemas.microsoft.com/office/word/2006/wordml" mc:Ignorable="w14 w15 w16se w16cid w16 w16cex w16sdtdh w16sdtfl w16du wp14">
+  <w:footnote w:type="separator" w:id="-1">
+    <w:p>
+      <w:pPr>
+        <w:spacing w:before="0" w:after="0"/>
+      </w:pPr>
+      <w:r>
+        <w:separator/>
+      </w:r>
+    </w:p>
+  </w:footnote>
+  <w:footnote w:type="continuationSeparator" w:id="0">
+    <w:p>
+      <w:pPr>
+        <w:spacing w:before="0" w:after="0"/>
+      </w:pPr>
+      <w:r>
+        <w:continuationSeparator/>
+      </w:r>
+    </w:p>
+  </w:footnote>
+</w:footnotes>
+</file>
+
+<file path=word/numbering.xml><?xml version="1.0" encoding="utf-8"?>
+<w:numbering xmlns:wpc="http://schemas.microsoft.com/office/word/2010/wordprocessingCanvas" xmlns:cx="http://schemas.microsoft.com/office/drawing/2014/chartex" xmlns:cx1="http://schemas.microsoft.com/office/drawing/2015/9/8/chartex" xmlns:cx2="http://schemas.microsoft.com/office/drawing/2015/10/21/chartex" xmlns:cx3="http://schemas.microsoft.com/office/drawing/2016/5/9/chartex" xmlns:cx4="http://schemas.microsoft.com/office/drawing/2016/5/10/chartex" xmlns:cx5="http://schemas.microsoft.com/office/drawing/2016/5/11/chartex" xmlns:cx6="http://schemas.microsoft.com/office/drawing/2016/5/12/chartex" xmlns:cx7="http://schemas.microsoft.com/office/drawing/2016/5/13/chartex" xmlns:cx8="http://schemas.microsoft.com/office/drawing/2016/5/14/chartex" xmlns:mc="http://schemas.openxmlformats.org/markup-compatibility/2006" xmlns:m="http://schemas.openxmlformats.org/officeDocument/2006/math" xmlns:aink="http://schemas.microsoft.com/office/drawing/2016/ink" xmlns:am3d="http://schemas.microsoft.com/office/drawing/2017/model3d" xmlns:oel="http://schemas.microsoft.com/office/2019/extlst" xmlns:r="http://schemas.openxmlformats.org/officeDocument/2006/relationships" xmlns:wp14="http://schemas.microsoft.com/office/word/2010/wordprocessingDrawing" xmlns:wp="http://schemas.openxmlformats.org/drawingml/2006/wordprocessingDrawing" xmlns:wpg="http://schemas.microsoft.com/office/word/2010/wordprocessingGroup" xmlns:wpi="http://schemas.microsoft.com/office/word/2010/wordprocessingInk" xmlns:wps="http://schemas.microsoft.com/office/word/2010/wordprocessingShape" xmlns:o="urn:schemas-microsoft-com:office:office" xmlns:v="urn:schemas-microsoft-com:vml" xmlns:w10="urn:schemas-microsoft-com:office:word" xmlns:w="http://schemas.openxmlformats.org/wordprocessingml/2006/main" xmlns:w14="http://schemas.microsoft.com/office/word/2010/wordml" xmlns:w15="http://schemas.microsoft.com/office/word/2012/wordml" xmlns:w16cex="http://schemas.microsoft.com/office/word/2018/wordml/cex" xmlns:w16cid="http://schemas.microsoft.com/office/word/2016/wordml/cid" xmlns:w16="http://schemas.microsoft.com/office/word/2018/wordml" xmlns:w16sdtdh="http://schemas.microsoft.com/office/word/2020/wordml/sdtdatahash" xmlns:w16sdtfl="http://schemas.microsoft.com/office/word/2024/wordml/sdtformatlock" xmlns:w16se="http://schemas.microsoft.com/office/word/2015/wordml/symex" xmlns:w16du="http://schemas.microsoft.com/office/word/2023/wordml/word16du" xmlns:wne="http://schemas.microsoft.com/office/word/2006/wordml" mc:Ignorable="w14 w15 w16se w16cid w16 w16cex w16sdtdh w16sdtfl w16du wp14">
+  <w:abstractNum w:abstractNumId="0" w15:restartNumberingAfterBreak="0">
+    <w:nsid w:val="189D657F"/>
+    <w:multiLevelType w:val="multilevel"/>
+    <w:tmpl w:val="FA841D5C"/>
+    <w:lvl w:ilvl="0">
+      <w:numFmt w:val="bullet"/>
+      <w:lvlText w:val=""/>
+      <w:lvlJc w:val="left"/>
+      <w:pPr>
+        <w:tabs>
+          <w:tab w:val="num" w:pos="0"/>
+        </w:tabs>
+        <w:ind w:left="720" w:hanging="360"/>
+      </w:pPr>
+      <w:rPr>
+        <w:rFonts w:ascii="Symbol" w:hAnsi="Symbol" w:cs="Symbol" w:hint="default"/>
+      </w:rPr>
+    </w:lvl>
+    <w:lvl w:ilvl="1">
+      <w:numFmt w:val="bullet"/>
+      <w:lvlText w:val="o"/>
+      <w:lvlJc w:val="left"/>
+      <w:pPr>
+        <w:tabs>
+          <w:tab w:val="num" w:pos="0"/>
+        </w:tabs>
+        <w:ind w:left="1440" w:hanging="360"/>
+      </w:pPr>
+      <w:rPr>
+        <w:rFonts w:ascii="Courier New" w:hAnsi="Courier New" w:cs="Courier New" w:hint="default"/>
+      </w:rPr>
+    </w:lvl>
+    <w:lvl w:ilvl="2">
+      <w:numFmt w:val="bullet"/>
+      <w:lvlText w:val=""/>
+      <w:lvlJc w:val="left"/>
+      <w:pPr>
+        <w:tabs>
+          <w:tab w:val="num" w:pos="0"/>
+        </w:tabs>
+        <w:ind w:left="2160" w:hanging="360"/>
+      </w:pPr>
+      <w:rPr>
+        <w:rFonts w:ascii="Wingdings" w:hAnsi="Wingdings" w:cs="Wingdings" w:hint="default"/>
+      </w:rPr>
+    </w:lvl>
+    <w:lvl w:ilvl="3">
+      <w:numFmt w:val="bullet"/>
+      <w:lvlText w:val=""/>
+      <w:lvlJc w:val="left"/>
+      <w:pPr>
+        <w:tabs>
+          <w:tab w:val="num" w:pos="0"/>
+        </w:tabs>
+        <w:ind w:left="2880" w:hanging="360"/>
+      </w:pPr>
+      <w:rPr>
+        <w:rFonts w:ascii="Symbol" w:hAnsi="Symbol" w:cs="Symbol" w:hint="default"/>
+      </w:rPr>
+    </w:lvl>
+    <w:lvl w:ilvl="4">
+      <w:numFmt w:val="bullet"/>
+      <w:lvlText w:val="o"/>
+      <w:lvlJc w:val="left"/>
+      <w:pPr>
+        <w:tabs>
+          <w:tab w:val="num" w:pos="0"/>
+        </w:tabs>
+        <w:ind w:left="3600" w:hanging="360"/>
+      </w:pPr>
+      <w:rPr>
+        <w:rFonts w:ascii="Courier New" w:hAnsi="Courier New" w:cs="Courier New" w:hint="default"/>
+      </w:rPr>
+    </w:lvl>
+    <w:lvl w:ilvl="5">
+      <w:numFmt w:val="bullet"/>
+      <w:lvlText w:val=""/>
+      <w:lvlJc w:val="left"/>
+      <w:pPr>
+        <w:tabs>
+          <w:tab w:val="num" w:pos="0"/>
+        </w:tabs>
+        <w:ind w:left="4320" w:hanging="360"/>
+      </w:pPr>
+      <w:rPr>
+        <w:rFonts w:ascii="Wingdings" w:hAnsi="Wingdings" w:cs="Wingdings" w:hint="default"/>
+      </w:rPr>
+    </w:lvl>
+    <w:lvl w:ilvl="6">
+      <w:numFmt w:val="bullet"/>
+      <w:lvlText w:val=""/>
+      <w:lvlJc w:val="left"/>
+      <w:pPr>
+        <w:tabs>
+          <w:tab w:val="num" w:pos="0"/>
+        </w:tabs>
+        <w:ind w:left="5040" w:hanging="360"/>
+      </w:pPr>
+      <w:rPr>
+        <w:rFonts w:ascii="Symbol" w:hAnsi="Symbol" w:cs="Symbol" w:hint="default"/>
+      </w:rPr>
+    </w:lvl>
+    <w:lvl w:ilvl="7">
+      <w:numFmt w:val="bullet"/>
+      <w:lvlText w:val="o"/>
+      <w:lvlJc w:val="left"/>
+      <w:pPr>
+        <w:tabs>
+          <w:tab w:val="num" w:pos="0"/>
+        </w:tabs>
+        <w:ind w:left="5760" w:hanging="360"/>
+      </w:pPr>
+      <w:rPr>
+        <w:rFonts w:ascii="Courier New" w:hAnsi="Courier New" w:cs="Courier New" w:hint="default"/>
+      </w:rPr>
+    </w:lvl>
+    <w:lvl w:ilvl="8">
+      <w:numFmt w:val="bullet"/>
+      <w:lvlText w:val=""/>
+      <w:lvlJc w:val="left"/>
+      <w:pPr>
+        <w:tabs>
+          <w:tab w:val="num" w:pos="0"/>
+        </w:tabs>
+        <w:ind w:left="6480" w:hanging="360"/>
+      </w:pPr>
+      <w:rPr>
+        <w:rFonts w:ascii="Wingdings" w:hAnsi="Wingdings" w:cs="Wingdings" w:hint="default"/>
+      </w:rPr>
+    </w:lvl>
+  </w:abstractNum>
+  <w:abstractNum w:abstractNumId="1" w15:restartNumberingAfterBreak="0">
+    <w:nsid w:val="763D5ACC"/>
+    <w:multiLevelType w:val="multilevel"/>
+    <w:tmpl w:val="39642E8E"/>
+    <w:lvl w:ilvl="0">
+      <w:start w:val="1"/>
+      <w:numFmt w:val="none"/>
+      <w:suff w:val="nothing"/>
+      <w:lvlText w:val=""/>
+      <w:lvlJc w:val="left"/>
+      <w:pPr>
+        <w:tabs>
+          <w:tab w:val="num" w:pos="0"/>
+        </w:tabs>
+        <w:ind w:left="0" w:firstLine="0"/>
+      </w:pPr>
+    </w:lvl>
+    <w:lvl w:ilvl="1">
+      <w:start w:val="1"/>
+      <w:numFmt w:val="none"/>
+      <w:suff w:val="nothing"/>
+      <w:lvlText w:val=""/>
+      <w:lvlJc w:val="left"/>
+      <w:pPr>
+        <w:tabs>
+          <w:tab w:val="num" w:pos="0"/>
+        </w:tabs>
+        <w:ind w:left="0" w:firstLine="0"/>
+      </w:pPr>
+    </w:lvl>
+    <w:lvl w:ilvl="2">
+      <w:start w:val="1"/>
+      <w:numFmt w:val="none"/>
+      <w:suff w:val="nothing"/>
+      <w:lvlText w:val=""/>
+      <w:lvlJc w:val="left"/>
+      <w:pPr>
+        <w:tabs>
+          <w:tab w:val="num" w:pos="0"/>
+        </w:tabs>
+        <w:ind w:left="0" w:firstLine="0"/>
+      </w:pPr>
+    </w:lvl>
+    <w:lvl w:ilvl="3">
+      <w:start w:val="1"/>
+      <w:numFmt w:val="none"/>
+      <w:suff w:val="nothing"/>
+      <w:lvlText w:val=""/>
+      <w:lvlJc w:val="left"/>
+      <w:pPr>
+        <w:tabs>
+          <w:tab w:val="num" w:pos="0"/>
+        </w:tabs>
+        <w:ind w:left="0" w:firstLine="0"/>
+      </w:pPr>
+    </w:lvl>
+    <w:lvl w:ilvl="4">
+      <w:start w:val="1"/>
+      <w:numFmt w:val="none"/>
+      <w:suff w:val="nothing"/>
+      <w:lvlText w:val=""/>
+      <w:lvlJc w:val="left"/>
+      <w:pPr>
+        <w:tabs>
+          <w:tab w:val="num" w:pos="0"/>
+        </w:tabs>
+        <w:ind w:left="0" w:firstLine="0"/>
+      </w:pPr>
+    </w:lvl>
+    <w:lvl w:ilvl="5">
+      <w:start w:val="1"/>
+      <w:numFmt w:val="none"/>
+      <w:suff w:val="nothing"/>
+      <w:lvlText w:val=""/>
+      <w:lvlJc w:val="left"/>
+      <w:pPr>
+        <w:tabs>
+          <w:tab w:val="num" w:pos="0"/>
+        </w:tabs>
+        <w:ind w:left="0" w:firstLine="0"/>
+      </w:pPr>
+    </w:lvl>
+    <w:lvl w:ilvl="6">
+      <w:start w:val="1"/>
+      <w:numFmt w:val="none"/>
+      <w:suff w:val="nothing"/>
+      <w:lvlText w:val=""/>
+      <w:lvlJc w:val="left"/>
+      <w:pPr>
+        <w:tabs>
+          <w:tab w:val="num" w:pos="0"/>
+        </w:tabs>
+        <w:ind w:left="0" w:firstLine="0"/>
+      </w:pPr>
+    </w:lvl>
+    <w:lvl w:ilvl="7">
+      <w:start w:val="1"/>
+      <w:numFmt w:val="none"/>
+      <w:suff w:val="nothing"/>
+      <w:lvlText w:val=""/>
+      <w:lvlJc w:val="left"/>
+      <w:pPr>
+        <w:tabs>
+          <w:tab w:val="num" w:pos="0"/>
+        </w:tabs>
+        <w:ind w:left="0" w:firstLine="0"/>
+      </w:pPr>
+    </w:lvl>
+    <w:lvl w:ilvl="8">
+      <w:start w:val="1"/>
+      <w:numFmt w:val="none"/>
+      <w:suff w:val="nothing"/>
+      <w:lvlText w:val=""/>
+      <w:lvlJc w:val="left"/>
+      <w:pPr>
+        <w:tabs>
+          <w:tab w:val="num" w:pos="0"/>
+        </w:tabs>
+        <w:ind w:left="0" w:firstLine="0"/>
+      </w:pPr>
+    </w:lvl>
+  </w:abstractNum>
+  <w:abstractNum w:abstractNumId="2" w15:restartNumberingAfterBreak="0">
+    <w:nsid w:val="7CF642C1"/>
+    <w:multiLevelType w:val="multilevel"/>
+    <w:tmpl w:val="422264C8"/>
+    <w:lvl w:ilvl="0">
+      <w:numFmt w:val="bullet"/>
+      <w:lvlText w:val=""/>
+      <w:lvlJc w:val="left"/>
+      <w:pPr>
+        <w:tabs>
+          <w:tab w:val="num" w:pos="0"/>
+        </w:tabs>
+        <w:ind w:left="720" w:hanging="360"/>
+      </w:pPr>
+      <w:rPr>
+        <w:rFonts w:ascii="Symbol" w:hAnsi="Symbol" w:cs="Symbol" w:hint="default"/>
+      </w:rPr>
+    </w:lvl>
+    <w:lvl w:ilvl="1">
+      <w:numFmt w:val="bullet"/>
+      <w:lvlText w:val="o"/>
+      <w:lvlJc w:val="left"/>
+      <w:pPr>
+        <w:tabs>
+          <w:tab w:val="num" w:pos="0"/>
+        </w:tabs>
+        <w:ind w:left="1440" w:hanging="360"/>
+      </w:pPr>
+      <w:rPr>
+        <w:rFonts w:ascii="Courier New" w:hAnsi="Courier New" w:cs="Courier New" w:hint="default"/>
+      </w:rPr>
+    </w:lvl>
+    <w:lvl w:ilvl="2">
+      <w:numFmt w:val="bullet"/>
+      <w:lvlText w:val=""/>
+      <w:lvlJc w:val="left"/>
+      <w:pPr>
+        <w:tabs>
+          <w:tab w:val="num" w:pos="0"/>
+        </w:tabs>
+        <w:ind w:left="2160" w:hanging="360"/>
+      </w:pPr>
+      <w:rPr>
+        <w:rFonts w:ascii="Wingdings" w:hAnsi="Wingdings" w:cs="Wingdings" w:hint="default"/>
+      </w:rPr>
+    </w:lvl>
+    <w:lvl w:ilvl="3">
+      <w:numFmt w:val="bullet"/>
+      <w:lvlText w:val=""/>
+      <w:lvlJc w:val="left"/>
+      <w:pPr>
+        <w:tabs>
+          <w:tab w:val="num" w:pos="0"/>
+        </w:tabs>
+        <w:ind w:left="2880" w:hanging="360"/>
+      </w:pPr>
+      <w:rPr>
+        <w:rFonts w:ascii="Symbol" w:hAnsi="Symbol" w:cs="Symbol" w:hint="default"/>
+      </w:rPr>
+    </w:lvl>
+    <w:lvl w:ilvl="4">
+      <w:numFmt w:val="bullet"/>
+      <w:lvlText w:val="o"/>
+      <w:lvlJc w:val="left"/>
+      <w:pPr>
+        <w:tabs>
+          <w:tab w:val="num" w:pos="0"/>
+        </w:tabs>
+        <w:ind w:left="3600" w:hanging="360"/>
+      </w:pPr>
+      <w:rPr>
+        <w:rFonts w:ascii="Courier New" w:hAnsi="Courier New" w:cs="Courier New" w:hint="default"/>
+      </w:rPr>
+    </w:lvl>
+    <w:lvl w:ilvl="5">
+      <w:numFmt w:val="bullet"/>
+      <w:lvlText w:val=""/>
+      <w:lvlJc w:val="left"/>
+      <w:pPr>
+        <w:tabs>
+          <w:tab w:val="num" w:pos="0"/>
+        </w:tabs>
+        <w:ind w:left="4320" w:hanging="360"/>
+      </w:pPr>
+      <w:rPr>
+        <w:rFonts w:ascii="Wingdings" w:hAnsi="Wingdings" w:cs="Wingdings" w:hint="default"/>
+      </w:rPr>
+    </w:lvl>
+    <w:lvl w:ilvl="6">
+      <w:numFmt w:val="bullet"/>
+      <w:lvlText w:val=""/>
+      <w:lvlJc w:val="left"/>
+      <w:pPr>
+        <w:tabs>
+          <w:tab w:val="num" w:pos="0"/>
+        </w:tabs>
+        <w:ind w:left="5040" w:hanging="360"/>
+      </w:pPr>
+      <w:rPr>
+        <w:rFonts w:ascii="Symbol" w:hAnsi="Symbol" w:cs="Symbol" w:hint="default"/>
+      </w:rPr>
+    </w:lvl>
+    <w:lvl w:ilvl="7">
+      <w:numFmt w:val="bullet"/>
+      <w:lvlText w:val="o"/>
+      <w:lvlJc w:val="left"/>
+      <w:pPr>
+        <w:tabs>
+          <w:tab w:val="num" w:pos="0"/>
+        </w:tabs>
+        <w:ind w:left="5760" w:hanging="360"/>
+      </w:pPr>
+      <w:rPr>
+        <w:rFonts w:ascii="Courier New" w:hAnsi="Courier New" w:cs="Courier New" w:hint="default"/>
+      </w:rPr>
+    </w:lvl>
+    <w:lvl w:ilvl="8">
+      <w:numFmt w:val="bullet"/>
+      <w:lvlText w:val=""/>
+      <w:lvlJc w:val="left"/>
+      <w:pPr>
+        <w:tabs>
+          <w:tab w:val="num" w:pos="0"/>
+        </w:tabs>
+        <w:ind w:left="6480" w:hanging="360"/>
+      </w:pPr>
+      <w:rPr>
+        <w:rFonts w:ascii="Wingdings" w:hAnsi="Wingdings" w:cs="Wingdings" w:hint="default"/>
+      </w:rPr>
+    </w:lvl>
+  </w:abstractNum>
+  <w:num w:numId="1" w16cid:durableId="120657629">
+    <w:abstractNumId w:val="2"/>
+  </w:num>
+  <w:num w:numId="2" w16cid:durableId="1530487521">
+    <w:abstractNumId w:val="0"/>
+  </w:num>
+  <w:num w:numId="3" w16cid:durableId="1055467792">
+    <w:abstractNumId w:val="1"/>
+  </w:num>
+</w:numbering>
+</file>
+
 <file path=word/styles.xml><?xml version="1.0" encoding="utf-8"?>
-<w:styles xmlns:w="http://schemas.openxmlformats.org/wordprocessingml/2006/main" xmlns:w14="http://schemas.microsoft.com/office/word/2010/wordml" xmlns:mc="http://schemas.openxmlformats.org/markup-compatibility/2006" mc:Ignorable="w14">
+<w:styles xmlns:mc="http://schemas.openxmlformats.org/markup-compatibility/2006" xmlns:r="http://schemas.openxmlformats.org/officeDocument/2006/relationships" xmlns:w="http://schemas.openxmlformats.org/wordprocessingml/2006/main" xmlns:w14="http://schemas.microsoft.com/office/word/2010/wordml" xmlns:w15="http://schemas.microsoft.com/office/word/2012/wordml" xmlns:w16cex="http://schemas.microsoft.com/office/word/2018/wordml/cex" xmlns:w16cid="http://schemas.microsoft.com/office/word/2016/wordml/cid" xmlns:w16="http://schemas.microsoft.com/office/word/2018/wordml" xmlns:w16sdtdh="http://schemas.microsoft.com/office/word/2020/wordml/sdtdatahash" xmlns:w16sdtfl="http://schemas.microsoft.com/office/word/2024/wordml/sdtformatlock" xmlns:w16se="http://schemas.microsoft.com/office/word/2015/wordml/symex" xmlns:w16du="http://schemas.microsoft.com/office/word/2023/wordml/word16du" mc:Ignorable="w14 w15 w16se w16cid w16 w16cex w16sdtdh w16sdtfl w16du">
   <w:docDefaults>
     <w:rPrDefault>
       <w:rPr>
-        <w:rFonts w:ascii="Aptos" w:hAnsi="Aptos" w:eastAsia="Aptos" w:cs="" w:asciiTheme="minorHAnsi" w:cstheme="minorBidi" w:eastAsiaTheme="minorHAnsi" w:hAnsiTheme="minorHAnsi"/>
+        <w:rFonts w:asciiTheme="minorHAnsi" w:eastAsiaTheme="minorHAnsi" w:hAnsiTheme="minorHAnsi" w:cstheme="minorBidi"/>
         <w:sz w:val="24"/>
         <w:szCs w:val="24"/>
         <w:lang w:val="en-US" w:eastAsia="en-US" w:bidi="ar-SA"/>
@@ -4016,7 +4483,7 @@
     </w:rPrDefault>
     <w:pPrDefault>
       <w:pPr>
-        <w:suppressAutoHyphens w:val="true"/>
+        <w:suppressAutoHyphens/>
       </w:pPr>
     </w:pPrDefault>
   </w:docDefaults>
@@ -4261,29 +4728,22 @@
     <w:lsdException w:name="List Table 5 Dark Accent 6" w:uiPriority="50"/>
     <w:lsdException w:name="List Table 6 Colorful Accent 6" w:uiPriority="51"/>
     <w:lsdException w:name="List Table 7 Colorful Accent 6" w:uiPriority="52"/>
-    <w:lsdException w:name="Mention" w:uiPriority="99" w:semiHidden="1" w:unhideWhenUsed="1"/>
-    <w:lsdException w:name="Smart Hyperlink" w:uiPriority="99" w:semiHidden="1" w:unhideWhenUsed="1"/>
-    <w:lsdException w:name="Hashtag" w:uiPriority="99" w:semiHidden="1" w:unhideWhenUsed="1"/>
-    <w:lsdException w:name="Unresolved Mention" w:uiPriority="99" w:semiHidden="1" w:unhideWhenUsed="1"/>
-    <w:lsdException w:name="Smart Link" w:uiPriority="99" w:semiHidden="1" w:unhideWhenUsed="1"/>
+    <w:lsdException w:name="Mention" w:semiHidden="1" w:uiPriority="99" w:unhideWhenUsed="1"/>
+    <w:lsdException w:name="Smart Hyperlink" w:semiHidden="1" w:uiPriority="99" w:unhideWhenUsed="1"/>
+    <w:lsdException w:name="Hashtag" w:semiHidden="1" w:uiPriority="99" w:unhideWhenUsed="1"/>
+    <w:lsdException w:name="Unresolved Mention" w:semiHidden="1" w:uiPriority="99" w:unhideWhenUsed="1"/>
+    <w:lsdException w:name="Smart Link" w:semiHidden="1" w:uiPriority="99" w:unhideWhenUsed="1"/>
   </w:latentStyles>
-  <w:style w:type="paragraph" w:styleId="Normal" w:default="1">
+  <w:style w:type="paragraph" w:default="1" w:styleId="Normal">
     <w:name w:val="Normal"/>
     <w:qFormat/>
-    <w:rsid w:val="00f1108d"/>
+    <w:rsid w:val="008D4946"/>
     <w:pPr>
-      <w:widowControl/>
-      <w:bidi w:val="0"/>
       <w:spacing w:before="100" w:after="100"/>
-      <w:jc w:val="start"/>
     </w:pPr>
     <w:rPr>
-      <w:rFonts w:ascii="Cambria" w:hAnsi="Cambria" w:eastAsia="Aptos" w:cs="" w:cstheme="minorBidi" w:eastAsiaTheme="minorHAnsi"/>
-      <w:color w:val="auto"/>
-      <w:kern w:val="0"/>
+      <w:rFonts w:ascii="Arial" w:hAnsi="Arial"/>
       <w:sz w:val="22"/>
-      <w:szCs w:val="24"/>
-      <w:lang w:val="en-US" w:eastAsia="en-US" w:bidi="ar-SA"/>
     </w:rPr>
   </w:style>
   <w:style w:type="paragraph" w:styleId="Heading1">
@@ -4293,17 +4753,17 @@
     <w:link w:val="Heading1Char"/>
     <w:uiPriority w:val="9"/>
     <w:qFormat/>
-    <w:rsid w:val="007225f1"/>
+    <w:rsid w:val="007225F1"/>
     <w:pPr>
-      <w:keepNext w:val="true"/>
+      <w:keepNext/>
       <w:keepLines/>
       <w:spacing w:before="80" w:after="80"/>
       <w:outlineLvl w:val="0"/>
     </w:pPr>
     <w:rPr>
-      <w:rFonts w:ascii="Arial" w:hAnsi="Arial" w:eastAsia="" w:cs="" w:cstheme="majorBidi" w:eastAsiaTheme="majorEastAsia"/>
+      <w:rFonts w:eastAsiaTheme="majorEastAsia" w:cstheme="majorBidi"/>
       <w:b/>
-      <w:color w:themeColor="text1" w:val="000000"/>
+      <w:color w:val="000000" w:themeColor="text1"/>
       <w:szCs w:val="40"/>
     </w:rPr>
   </w:style>
@@ -4316,15 +4776,15 @@
     <w:semiHidden/>
     <w:unhideWhenUsed/>
     <w:qFormat/>
-    <w:rsid w:val="007225f1"/>
+    <w:rsid w:val="007225F1"/>
     <w:pPr>
-      <w:keepNext w:val="true"/>
+      <w:keepNext/>
       <w:keepLines/>
       <w:spacing w:before="220" w:after="0"/>
       <w:outlineLvl w:val="1"/>
     </w:pPr>
     <w:rPr>
-      <w:rFonts w:ascii="Arial" w:hAnsi="Arial" w:eastAsia="" w:cs="" w:cstheme="majorBidi" w:eastAsiaTheme="majorEastAsia"/>
+      <w:rFonts w:eastAsiaTheme="majorEastAsia" w:cstheme="majorBidi"/>
       <w:b/>
       <w:szCs w:val="32"/>
     </w:rPr>
@@ -4338,15 +4798,15 @@
     <w:semiHidden/>
     <w:unhideWhenUsed/>
     <w:qFormat/>
-    <w:rsid w:val="00a57edb"/>
+    <w:rsid w:val="00A57EDB"/>
     <w:pPr>
-      <w:keepNext w:val="true"/>
+      <w:keepNext/>
       <w:keepLines/>
       <w:spacing w:before="160" w:after="80"/>
       <w:outlineLvl w:val="2"/>
     </w:pPr>
     <w:rPr>
-      <w:rFonts w:eastAsia="" w:cs="" w:cstheme="majorBidi" w:eastAsiaTheme="majorEastAsia"/>
+      <w:rFonts w:eastAsiaTheme="majorEastAsia" w:cstheme="majorBidi"/>
       <w:b/>
       <w:i/>
       <w:szCs w:val="28"/>
@@ -4363,13 +4823,13 @@
     <w:qFormat/>
     <w:rsid w:val="00504587"/>
     <w:pPr>
-      <w:keepNext w:val="true"/>
+      <w:keepNext/>
       <w:keepLines/>
       <w:spacing w:before="220" w:after="40"/>
       <w:outlineLvl w:val="3"/>
     </w:pPr>
     <w:rPr>
-      <w:rFonts w:eastAsia="" w:cs="" w:cstheme="majorBidi" w:eastAsiaTheme="majorEastAsia"/>
+      <w:rFonts w:eastAsiaTheme="majorEastAsia" w:cstheme="majorBidi"/>
       <w:iCs/>
       <w:u w:val="single"/>
     </w:rPr>
@@ -4383,16 +4843,16 @@
     <w:semiHidden/>
     <w:unhideWhenUsed/>
     <w:qFormat/>
-    <w:rsid w:val="00a10fd9"/>
+    <w:rsid w:val="00A10FD9"/>
     <w:pPr>
-      <w:keepNext w:val="true"/>
+      <w:keepNext/>
       <w:keepLines/>
       <w:spacing w:before="80" w:after="40"/>
       <w:outlineLvl w:val="4"/>
     </w:pPr>
     <w:rPr>
-      <w:rFonts w:eastAsia="" w:cs="" w:cstheme="majorBidi" w:eastAsiaTheme="majorEastAsia"/>
-      <w:color w:themeColor="accent1" w:themeShade="bf" w:val="0F4761"/>
+      <w:rFonts w:eastAsiaTheme="majorEastAsia" w:cstheme="majorBidi"/>
+      <w:color w:val="0F4761" w:themeColor="accent1" w:themeShade="BF"/>
     </w:rPr>
   </w:style>
   <w:style w:type="paragraph" w:styleId="Heading6">
@@ -4404,18 +4864,18 @@
     <w:semiHidden/>
     <w:unhideWhenUsed/>
     <w:qFormat/>
-    <w:rsid w:val="00a10fd9"/>
+    <w:rsid w:val="00A10FD9"/>
     <w:pPr>
-      <w:keepNext w:val="true"/>
+      <w:keepNext/>
       <w:keepLines/>
       <w:spacing w:before="40" w:after="0"/>
       <w:outlineLvl w:val="5"/>
     </w:pPr>
     <w:rPr>
-      <w:rFonts w:eastAsia="" w:cs="" w:cstheme="majorBidi" w:eastAsiaTheme="majorEastAsia"/>
+      <w:rFonts w:eastAsiaTheme="majorEastAsia" w:cstheme="majorBidi"/>
       <w:i/>
       <w:iCs/>
-      <w:color w:themeColor="text1" w:themeTint="a6" w:val="595959"/>
+      <w:color w:val="595959" w:themeColor="text1" w:themeTint="A6"/>
     </w:rPr>
   </w:style>
   <w:style w:type="paragraph" w:styleId="Heading7">
@@ -4427,16 +4887,16 @@
     <w:semiHidden/>
     <w:unhideWhenUsed/>
     <w:qFormat/>
-    <w:rsid w:val="00a10fd9"/>
+    <w:rsid w:val="00A10FD9"/>
     <w:pPr>
-      <w:keepNext w:val="true"/>
+      <w:keepNext/>
       <w:keepLines/>
       <w:spacing w:before="40" w:after="0"/>
       <w:outlineLvl w:val="6"/>
     </w:pPr>
     <w:rPr>
-      <w:rFonts w:eastAsia="" w:cs="" w:cstheme="majorBidi" w:eastAsiaTheme="majorEastAsia"/>
-      <w:color w:themeColor="text1" w:themeTint="a6" w:val="595959"/>
+      <w:rFonts w:eastAsiaTheme="majorEastAsia" w:cstheme="majorBidi"/>
+      <w:color w:val="595959" w:themeColor="text1" w:themeTint="A6"/>
     </w:rPr>
   </w:style>
   <w:style w:type="paragraph" w:styleId="Heading8">
@@ -4448,18 +4908,18 @@
     <w:semiHidden/>
     <w:unhideWhenUsed/>
     <w:qFormat/>
-    <w:rsid w:val="00a10fd9"/>
+    <w:rsid w:val="00A10FD9"/>
     <w:pPr>
-      <w:keepNext w:val="true"/>
+      <w:keepNext/>
       <w:keepLines/>
-      <w:spacing w:before="100" w:after="0"/>
+      <w:spacing w:after="0"/>
       <w:outlineLvl w:val="7"/>
     </w:pPr>
     <w:rPr>
-      <w:rFonts w:eastAsia="" w:cs="" w:cstheme="majorBidi" w:eastAsiaTheme="majorEastAsia"/>
+      <w:rFonts w:eastAsiaTheme="majorEastAsia" w:cstheme="majorBidi"/>
       <w:i/>
       <w:iCs/>
-      <w:color w:themeColor="text1" w:themeTint="d8" w:val="272727"/>
+      <w:color w:val="272727" w:themeColor="text1" w:themeTint="D8"/>
     </w:rPr>
   </w:style>
   <w:style w:type="paragraph" w:styleId="Heading9">
@@ -4471,102 +4931,121 @@
     <w:semiHidden/>
     <w:unhideWhenUsed/>
     <w:qFormat/>
-    <w:rsid w:val="00a10fd9"/>
+    <w:rsid w:val="00A10FD9"/>
     <w:pPr>
-      <w:keepNext w:val="true"/>
+      <w:keepNext/>
       <w:keepLines/>
-      <w:spacing w:before="100" w:after="0"/>
+      <w:spacing w:after="0"/>
       <w:outlineLvl w:val="8"/>
     </w:pPr>
     <w:rPr>
-      <w:rFonts w:eastAsia="" w:cs="" w:cstheme="majorBidi" w:eastAsiaTheme="majorEastAsia"/>
-      <w:color w:themeColor="text1" w:themeTint="d8" w:val="272727"/>
-    </w:rPr>
-  </w:style>
-  <w:style w:type="character" w:styleId="DefaultParagraphFont" w:default="1">
+      <w:rFonts w:eastAsiaTheme="majorEastAsia" w:cstheme="majorBidi"/>
+      <w:color w:val="272727" w:themeColor="text1" w:themeTint="D8"/>
+    </w:rPr>
+  </w:style>
+  <w:style w:type="character" w:default="1" w:styleId="DefaultParagraphFont">
     <w:name w:val="Default Paragraph Font"/>
     <w:uiPriority w:val="1"/>
     <w:semiHidden/>
     <w:unhideWhenUsed/>
-    <w:qFormat/>
-    <w:rPr/>
-  </w:style>
-  <w:style w:type="character" w:styleId="TitleChar" w:customStyle="1">
+  </w:style>
+  <w:style w:type="table" w:default="1" w:styleId="TableNormal">
+    <w:name w:val="Normal Table"/>
+    <w:uiPriority w:val="99"/>
+    <w:semiHidden/>
+    <w:unhideWhenUsed/>
+    <w:tblPr>
+      <w:tblInd w:w="0" w:type="dxa"/>
+      <w:tblCellMar>
+        <w:top w:w="0" w:type="dxa"/>
+        <w:left w:w="108" w:type="dxa"/>
+        <w:bottom w:w="0" w:type="dxa"/>
+        <w:right w:w="108" w:type="dxa"/>
+      </w:tblCellMar>
+    </w:tblPr>
+  </w:style>
+  <w:style w:type="numbering" w:default="1" w:styleId="NoList">
+    <w:name w:val="No List"/>
+    <w:uiPriority w:val="99"/>
+    <w:semiHidden/>
+    <w:unhideWhenUsed/>
+  </w:style>
+  <w:style w:type="character" w:customStyle="1" w:styleId="TitleChar">
     <w:name w:val="Title Char"/>
     <w:basedOn w:val="DefaultParagraphFont"/>
     <w:link w:val="Title"/>
     <w:uiPriority w:val="10"/>
     <w:qFormat/>
-    <w:rsid w:val="007225f1"/>
-    <w:rPr>
-      <w:rFonts w:ascii="Arial" w:hAnsi="Arial" w:eastAsia="" w:cs="" w:cstheme="majorBidi" w:eastAsiaTheme="majorEastAsia"/>
+    <w:rsid w:val="007225F1"/>
+    <w:rPr>
+      <w:rFonts w:ascii="Arial" w:eastAsiaTheme="majorEastAsia" w:hAnsi="Arial" w:cstheme="majorBidi"/>
       <w:b/>
       <w:sz w:val="22"/>
       <w:szCs w:val="56"/>
     </w:rPr>
   </w:style>
-  <w:style w:type="character" w:styleId="SubtitleChar" w:customStyle="1">
+  <w:style w:type="character" w:customStyle="1" w:styleId="SubtitleChar">
     <w:name w:val="Subtitle Char"/>
     <w:basedOn w:val="DefaultParagraphFont"/>
     <w:link w:val="Subtitle"/>
     <w:uiPriority w:val="11"/>
     <w:qFormat/>
-    <w:rsid w:val="00a10fd9"/>
-    <w:rPr>
-      <w:rFonts w:eastAsia="" w:cs="" w:cstheme="majorBidi" w:eastAsiaTheme="majorEastAsia"/>
-      <w:color w:themeColor="text1" w:themeTint="a6" w:val="595959"/>
+    <w:rsid w:val="00A10FD9"/>
+    <w:rPr>
+      <w:rFonts w:eastAsiaTheme="majorEastAsia" w:cstheme="majorBidi"/>
+      <w:color w:val="595959" w:themeColor="text1" w:themeTint="A6"/>
       <w:spacing w:val="15"/>
       <w:sz w:val="28"/>
       <w:szCs w:val="28"/>
     </w:rPr>
   </w:style>
-  <w:style w:type="character" w:styleId="Heading1Char" w:customStyle="1">
+  <w:style w:type="character" w:customStyle="1" w:styleId="Heading1Char">
     <w:name w:val="Heading 1 Char"/>
     <w:basedOn w:val="DefaultParagraphFont"/>
     <w:link w:val="Heading1"/>
     <w:uiPriority w:val="9"/>
     <w:qFormat/>
-    <w:rsid w:val="007225f1"/>
-    <w:rPr>
-      <w:rFonts w:ascii="Arial" w:hAnsi="Arial" w:eastAsia="" w:cs="" w:cstheme="majorBidi" w:eastAsiaTheme="majorEastAsia"/>
+    <w:rsid w:val="007225F1"/>
+    <w:rPr>
+      <w:rFonts w:ascii="Arial" w:eastAsiaTheme="majorEastAsia" w:hAnsi="Arial" w:cstheme="majorBidi"/>
       <w:b/>
-      <w:color w:themeColor="text1" w:val="000000"/>
+      <w:color w:val="000000" w:themeColor="text1"/>
       <w:sz w:val="22"/>
       <w:szCs w:val="40"/>
     </w:rPr>
   </w:style>
-  <w:style w:type="character" w:styleId="Heading2Char" w:customStyle="1">
+  <w:style w:type="character" w:customStyle="1" w:styleId="Heading2Char">
     <w:name w:val="Heading 2 Char"/>
     <w:basedOn w:val="DefaultParagraphFont"/>
     <w:link w:val="Heading2"/>
     <w:uiPriority w:val="9"/>
     <w:semiHidden/>
     <w:qFormat/>
-    <w:rsid w:val="007225f1"/>
-    <w:rPr>
-      <w:rFonts w:ascii="Arial" w:hAnsi="Arial" w:eastAsia="" w:cs="" w:cstheme="majorBidi" w:eastAsiaTheme="majorEastAsia"/>
+    <w:rsid w:val="007225F1"/>
+    <w:rPr>
+      <w:rFonts w:ascii="Arial" w:eastAsiaTheme="majorEastAsia" w:hAnsi="Arial" w:cstheme="majorBidi"/>
       <w:b/>
       <w:sz w:val="22"/>
       <w:szCs w:val="32"/>
     </w:rPr>
   </w:style>
-  <w:style w:type="character" w:styleId="Heading3Char" w:customStyle="1">
+  <w:style w:type="character" w:customStyle="1" w:styleId="Heading3Char">
     <w:name w:val="Heading 3 Char"/>
     <w:basedOn w:val="DefaultParagraphFont"/>
     <w:link w:val="Heading3"/>
     <w:uiPriority w:val="9"/>
     <w:semiHidden/>
     <w:qFormat/>
-    <w:rsid w:val="00a57edb"/>
-    <w:rPr>
-      <w:rFonts w:ascii="Arial" w:hAnsi="Arial" w:eastAsia="" w:cs="" w:cstheme="majorBidi" w:eastAsiaTheme="majorEastAsia"/>
+    <w:rsid w:val="00A57EDB"/>
+    <w:rPr>
+      <w:rFonts w:ascii="Arial" w:eastAsiaTheme="majorEastAsia" w:hAnsi="Arial" w:cstheme="majorBidi"/>
       <w:b/>
       <w:i/>
       <w:sz w:val="22"/>
       <w:szCs w:val="28"/>
     </w:rPr>
   </w:style>
-  <w:style w:type="character" w:styleId="Heading4Char" w:customStyle="1">
+  <w:style w:type="character" w:customStyle="1" w:styleId="Heading4Char">
     <w:name w:val="Heading 4 Char"/>
     <w:basedOn w:val="DefaultParagraphFont"/>
     <w:link w:val="Heading4"/>
@@ -4575,109 +5054,114 @@
     <w:qFormat/>
     <w:rsid w:val="00504587"/>
     <w:rPr>
-      <w:rFonts w:ascii="Cambria" w:hAnsi="Cambria" w:eastAsia="" w:cs="" w:cstheme="majorBidi" w:eastAsiaTheme="majorEastAsia"/>
+      <w:rFonts w:ascii="Cambria" w:eastAsiaTheme="majorEastAsia" w:hAnsi="Cambria" w:cstheme="majorBidi"/>
       <w:iCs/>
       <w:sz w:val="22"/>
       <w:u w:val="single"/>
     </w:rPr>
   </w:style>
-  <w:style w:type="character" w:styleId="Heading5Char" w:customStyle="1">
+  <w:style w:type="character" w:customStyle="1" w:styleId="Heading5Char">
     <w:name w:val="Heading 5 Char"/>
     <w:basedOn w:val="DefaultParagraphFont"/>
     <w:link w:val="Heading5"/>
     <w:uiPriority w:val="9"/>
     <w:semiHidden/>
     <w:qFormat/>
-    <w:rsid w:val="00a10fd9"/>
-    <w:rPr>
-      <w:rFonts w:eastAsia="" w:cs="" w:cstheme="majorBidi" w:eastAsiaTheme="majorEastAsia"/>
-      <w:color w:themeColor="accent1" w:themeShade="bf" w:val="0F4761"/>
-    </w:rPr>
-  </w:style>
-  <w:style w:type="character" w:styleId="Heading6Char" w:customStyle="1">
+    <w:rsid w:val="00A10FD9"/>
+    <w:rPr>
+      <w:rFonts w:eastAsiaTheme="majorEastAsia" w:cstheme="majorBidi"/>
+      <w:color w:val="0F4761" w:themeColor="accent1" w:themeShade="BF"/>
+    </w:rPr>
+  </w:style>
+  <w:style w:type="character" w:customStyle="1" w:styleId="Heading6Char">
     <w:name w:val="Heading 6 Char"/>
     <w:basedOn w:val="DefaultParagraphFont"/>
     <w:link w:val="Heading6"/>
     <w:uiPriority w:val="9"/>
     <w:semiHidden/>
     <w:qFormat/>
-    <w:rsid w:val="00a10fd9"/>
-    <w:rPr>
-      <w:rFonts w:eastAsia="" w:cs="" w:cstheme="majorBidi" w:eastAsiaTheme="majorEastAsia"/>
+    <w:rsid w:val="00A10FD9"/>
+    <w:rPr>
+      <w:rFonts w:eastAsiaTheme="majorEastAsia" w:cstheme="majorBidi"/>
       <w:i/>
       <w:iCs/>
-      <w:color w:themeColor="text1" w:themeTint="a6" w:val="595959"/>
-    </w:rPr>
-  </w:style>
-  <w:style w:type="character" w:styleId="Heading7Char" w:customStyle="1">
+      <w:color w:val="595959" w:themeColor="text1" w:themeTint="A6"/>
+    </w:rPr>
+  </w:style>
+  <w:style w:type="character" w:customStyle="1" w:styleId="Heading7Char">
     <w:name w:val="Heading 7 Char"/>
     <w:basedOn w:val="DefaultParagraphFont"/>
     <w:link w:val="Heading7"/>
     <w:uiPriority w:val="9"/>
     <w:semiHidden/>
     <w:qFormat/>
-    <w:rsid w:val="00a10fd9"/>
-    <w:rPr>
-      <w:rFonts w:eastAsia="" w:cs="" w:cstheme="majorBidi" w:eastAsiaTheme="majorEastAsia"/>
-      <w:color w:themeColor="text1" w:themeTint="a6" w:val="595959"/>
-    </w:rPr>
-  </w:style>
-  <w:style w:type="character" w:styleId="Heading8Char" w:customStyle="1">
+    <w:rsid w:val="00A10FD9"/>
+    <w:rPr>
+      <w:rFonts w:eastAsiaTheme="majorEastAsia" w:cstheme="majorBidi"/>
+      <w:color w:val="595959" w:themeColor="text1" w:themeTint="A6"/>
+    </w:rPr>
+  </w:style>
+  <w:style w:type="character" w:customStyle="1" w:styleId="Heading8Char">
     <w:name w:val="Heading 8 Char"/>
     <w:basedOn w:val="DefaultParagraphFont"/>
     <w:link w:val="Heading8"/>
     <w:uiPriority w:val="9"/>
     <w:semiHidden/>
     <w:qFormat/>
-    <w:rsid w:val="00a10fd9"/>
-    <w:rPr>
-      <w:rFonts w:eastAsia="" w:cs="" w:cstheme="majorBidi" w:eastAsiaTheme="majorEastAsia"/>
+    <w:rsid w:val="00A10FD9"/>
+    <w:rPr>
+      <w:rFonts w:eastAsiaTheme="majorEastAsia" w:cstheme="majorBidi"/>
       <w:i/>
       <w:iCs/>
-      <w:color w:themeColor="text1" w:themeTint="d8" w:val="272727"/>
-    </w:rPr>
-  </w:style>
-  <w:style w:type="character" w:styleId="Heading9Char" w:customStyle="1">
+      <w:color w:val="272727" w:themeColor="text1" w:themeTint="D8"/>
+    </w:rPr>
+  </w:style>
+  <w:style w:type="character" w:customStyle="1" w:styleId="Heading9Char">
     <w:name w:val="Heading 9 Char"/>
     <w:basedOn w:val="DefaultParagraphFont"/>
     <w:link w:val="Heading9"/>
     <w:uiPriority w:val="9"/>
     <w:semiHidden/>
     <w:qFormat/>
-    <w:rsid w:val="00a10fd9"/>
-    <w:rPr>
-      <w:rFonts w:eastAsia="" w:cs="" w:cstheme="majorBidi" w:eastAsiaTheme="majorEastAsia"/>
-      <w:color w:themeColor="text1" w:themeTint="d8" w:val="272727"/>
-    </w:rPr>
-  </w:style>
-  <w:style w:type="character" w:styleId="CaptionChar" w:customStyle="1">
+    <w:rsid w:val="00A10FD9"/>
+    <w:rPr>
+      <w:rFonts w:eastAsiaTheme="majorEastAsia" w:cstheme="majorBidi"/>
+      <w:color w:val="272727" w:themeColor="text1" w:themeTint="D8"/>
+    </w:rPr>
+  </w:style>
+  <w:style w:type="character" w:customStyle="1" w:styleId="CaptionChar">
     <w:name w:val="Caption Char"/>
     <w:basedOn w:val="DefaultParagraphFont"/>
     <w:link w:val="Caption"/>
     <w:qFormat/>
-    <w:rPr/>
-  </w:style>
-  <w:style w:type="character" w:styleId="VerbatimChar" w:customStyle="1">
+  </w:style>
+  <w:style w:type="character" w:customStyle="1" w:styleId="VerbatimChar">
     <w:name w:val="Verbatim Char"/>
     <w:basedOn w:val="CaptionChar"/>
     <w:link w:val="SourceCode"/>
     <w:qFormat/>
-    <w:rsid w:val="00cf68d1"/>
+    <w:rsid w:val="00CF68D1"/>
     <w:rPr>
       <w:rFonts w:ascii="Consolas" w:hAnsi="Consolas"/>
       <w:sz w:val="18"/>
-      <w:shd w:fill="F1F3F5" w:val="clear"/>
-    </w:rPr>
-  </w:style>
-  <w:style w:type="character" w:styleId="SectionNumber" w:customStyle="1">
+      <w:shd w:val="clear" w:color="auto" w:fill="F1F3F5"/>
+    </w:rPr>
+  </w:style>
+  <w:style w:type="character" w:customStyle="1" w:styleId="SectionNumber">
     <w:name w:val="Section Number"/>
     <w:basedOn w:val="CaptionChar"/>
     <w:qFormat/>
-    <w:rPr/>
-  </w:style>
-  <w:style w:type="character" w:styleId="FootnoteCharacters">
+  </w:style>
+  <w:style w:type="character" w:customStyle="1" w:styleId="FootnoteCharactersuser">
+    <w:name w:val="Footnote Characters (user)"/>
+    <w:basedOn w:val="CaptionChar"/>
+    <w:qFormat/>
+    <w:rPr>
+      <w:vertAlign w:val="superscript"/>
+    </w:rPr>
+  </w:style>
+  <w:style w:type="character" w:customStyle="1" w:styleId="FootnoteCharacters">
     <w:name w:val="Footnote Characters"/>
-    <w:basedOn w:val="CaptionChar"/>
     <w:qFormat/>
     <w:rPr>
       <w:vertAlign w:val="superscript"/>
@@ -4694,426 +5178,425 @@
     <w:basedOn w:val="CaptionChar"/>
     <w:uiPriority w:val="99"/>
     <w:rPr>
-      <w:color w:themeColor="accent1" w:val="156082"/>
-    </w:rPr>
-  </w:style>
-  <w:style w:type="character" w:styleId="KeywordTok" w:customStyle="1">
+      <w:color w:val="156082" w:themeColor="accent1"/>
+    </w:rPr>
+  </w:style>
+  <w:style w:type="character" w:customStyle="1" w:styleId="KeywordTok">
     <w:name w:val="KeywordTok"/>
     <w:basedOn w:val="VerbatimChar"/>
     <w:qFormat/>
-    <w:rsid w:val="00cf68d1"/>
+    <w:rsid w:val="00CF68D1"/>
     <w:rPr>
       <w:rFonts w:ascii="Consolas" w:hAnsi="Consolas"/>
       <w:b/>
       <w:color w:val="003B4F"/>
       <w:sz w:val="18"/>
-      <w:shd w:fill="F1F3F5" w:val="clear"/>
-    </w:rPr>
-  </w:style>
-  <w:style w:type="character" w:styleId="DataTypeTok" w:customStyle="1">
+      <w:shd w:val="clear" w:color="auto" w:fill="F1F3F5"/>
+    </w:rPr>
+  </w:style>
+  <w:style w:type="character" w:customStyle="1" w:styleId="DataTypeTok">
     <w:name w:val="DataTypeTok"/>
     <w:basedOn w:val="VerbatimChar"/>
     <w:qFormat/>
-    <w:rsid w:val="00cf68d1"/>
+    <w:rsid w:val="00CF68D1"/>
     <w:rPr>
       <w:rFonts w:ascii="Consolas" w:hAnsi="Consolas"/>
       <w:color w:val="AD0000"/>
       <w:sz w:val="18"/>
-      <w:shd w:fill="F1F3F5" w:val="clear"/>
-    </w:rPr>
-  </w:style>
-  <w:style w:type="character" w:styleId="DecValTok" w:customStyle="1">
+      <w:shd w:val="clear" w:color="auto" w:fill="F1F3F5"/>
+    </w:rPr>
+  </w:style>
+  <w:style w:type="character" w:customStyle="1" w:styleId="DecValTok">
     <w:name w:val="DecValTok"/>
     <w:basedOn w:val="VerbatimChar"/>
     <w:qFormat/>
-    <w:rsid w:val="00cf68d1"/>
+    <w:rsid w:val="00CF68D1"/>
     <w:rPr>
       <w:rFonts w:ascii="Consolas" w:hAnsi="Consolas"/>
       <w:color w:val="AD0000"/>
       <w:sz w:val="18"/>
-      <w:shd w:fill="F1F3F5" w:val="clear"/>
-    </w:rPr>
-  </w:style>
-  <w:style w:type="character" w:styleId="BaseNTok" w:customStyle="1">
+      <w:shd w:val="clear" w:color="auto" w:fill="F1F3F5"/>
+    </w:rPr>
+  </w:style>
+  <w:style w:type="character" w:customStyle="1" w:styleId="BaseNTok">
     <w:name w:val="BaseNTok"/>
     <w:basedOn w:val="VerbatimChar"/>
     <w:qFormat/>
-    <w:rsid w:val="00cf68d1"/>
+    <w:rsid w:val="00CF68D1"/>
     <w:rPr>
       <w:rFonts w:ascii="Consolas" w:hAnsi="Consolas"/>
       <w:color w:val="AD0000"/>
       <w:sz w:val="18"/>
-      <w:shd w:fill="F1F3F5" w:val="clear"/>
-    </w:rPr>
-  </w:style>
-  <w:style w:type="character" w:styleId="FloatTok" w:customStyle="1">
+      <w:shd w:val="clear" w:color="auto" w:fill="F1F3F5"/>
+    </w:rPr>
+  </w:style>
+  <w:style w:type="character" w:customStyle="1" w:styleId="FloatTok">
     <w:name w:val="FloatTok"/>
     <w:basedOn w:val="VerbatimChar"/>
     <w:qFormat/>
-    <w:rsid w:val="00cf68d1"/>
+    <w:rsid w:val="00CF68D1"/>
     <w:rPr>
       <w:rFonts w:ascii="Consolas" w:hAnsi="Consolas"/>
       <w:color w:val="AD0000"/>
       <w:sz w:val="18"/>
-      <w:shd w:fill="F1F3F5" w:val="clear"/>
-    </w:rPr>
-  </w:style>
-  <w:style w:type="character" w:styleId="ConstantTok" w:customStyle="1">
+      <w:shd w:val="clear" w:color="auto" w:fill="F1F3F5"/>
+    </w:rPr>
+  </w:style>
+  <w:style w:type="character" w:customStyle="1" w:styleId="ConstantTok">
     <w:name w:val="ConstantTok"/>
     <w:basedOn w:val="VerbatimChar"/>
     <w:qFormat/>
-    <w:rsid w:val="00cf68d1"/>
+    <w:rsid w:val="00CF68D1"/>
     <w:rPr>
       <w:rFonts w:ascii="Consolas" w:hAnsi="Consolas"/>
       <w:color w:val="8F5902"/>
       <w:sz w:val="18"/>
-      <w:shd w:fill="F1F3F5" w:val="clear"/>
-    </w:rPr>
-  </w:style>
-  <w:style w:type="character" w:styleId="CharTok" w:customStyle="1">
+      <w:shd w:val="clear" w:color="auto" w:fill="F1F3F5"/>
+    </w:rPr>
+  </w:style>
+  <w:style w:type="character" w:customStyle="1" w:styleId="CharTok">
     <w:name w:val="CharTok"/>
     <w:basedOn w:val="VerbatimChar"/>
     <w:qFormat/>
-    <w:rsid w:val="00cf68d1"/>
+    <w:rsid w:val="00CF68D1"/>
     <w:rPr>
       <w:rFonts w:ascii="Consolas" w:hAnsi="Consolas"/>
       <w:color w:val="20794D"/>
       <w:sz w:val="18"/>
-      <w:shd w:fill="F1F3F5" w:val="clear"/>
-    </w:rPr>
-  </w:style>
-  <w:style w:type="character" w:styleId="SpecialCharTok" w:customStyle="1">
+      <w:shd w:val="clear" w:color="auto" w:fill="F1F3F5"/>
+    </w:rPr>
+  </w:style>
+  <w:style w:type="character" w:customStyle="1" w:styleId="SpecialCharTok">
     <w:name w:val="SpecialCharTok"/>
     <w:basedOn w:val="VerbatimChar"/>
     <w:qFormat/>
-    <w:rsid w:val="00cf68d1"/>
+    <w:rsid w:val="00CF68D1"/>
     <w:rPr>
       <w:rFonts w:ascii="Consolas" w:hAnsi="Consolas"/>
       <w:color w:val="5E5E5E"/>
       <w:sz w:val="18"/>
-      <w:shd w:fill="F1F3F5" w:val="clear"/>
-    </w:rPr>
-  </w:style>
-  <w:style w:type="character" w:styleId="StringTok" w:customStyle="1">
+      <w:shd w:val="clear" w:color="auto" w:fill="F1F3F5"/>
+    </w:rPr>
+  </w:style>
+  <w:style w:type="character" w:customStyle="1" w:styleId="StringTok">
     <w:name w:val="StringTok"/>
     <w:basedOn w:val="VerbatimChar"/>
     <w:qFormat/>
-    <w:rsid w:val="00cf68d1"/>
+    <w:rsid w:val="00CF68D1"/>
     <w:rPr>
       <w:rFonts w:ascii="Consolas" w:hAnsi="Consolas"/>
       <w:color w:val="20794D"/>
       <w:sz w:val="18"/>
-      <w:shd w:fill="F1F3F5" w:val="clear"/>
-    </w:rPr>
-  </w:style>
-  <w:style w:type="character" w:styleId="VerbatimStringTok" w:customStyle="1">
+      <w:shd w:val="clear" w:color="auto" w:fill="F1F3F5"/>
+    </w:rPr>
+  </w:style>
+  <w:style w:type="character" w:customStyle="1" w:styleId="VerbatimStringTok">
     <w:name w:val="VerbatimStringTok"/>
     <w:basedOn w:val="VerbatimChar"/>
     <w:qFormat/>
-    <w:rsid w:val="00cf68d1"/>
+    <w:rsid w:val="00CF68D1"/>
     <w:rPr>
       <w:rFonts w:ascii="Consolas" w:hAnsi="Consolas"/>
       <w:color w:val="20794D"/>
       <w:sz w:val="18"/>
-      <w:shd w:fill="F1F3F5" w:val="clear"/>
-    </w:rPr>
-  </w:style>
-  <w:style w:type="character" w:styleId="SpecialStringTok" w:customStyle="1">
+      <w:shd w:val="clear" w:color="auto" w:fill="F1F3F5"/>
+    </w:rPr>
+  </w:style>
+  <w:style w:type="character" w:customStyle="1" w:styleId="SpecialStringTok">
     <w:name w:val="SpecialStringTok"/>
     <w:basedOn w:val="VerbatimChar"/>
     <w:qFormat/>
-    <w:rsid w:val="00cf68d1"/>
+    <w:rsid w:val="00CF68D1"/>
     <w:rPr>
       <w:rFonts w:ascii="Consolas" w:hAnsi="Consolas"/>
       <w:color w:val="20794D"/>
       <w:sz w:val="18"/>
-      <w:shd w:fill="F1F3F5" w:val="clear"/>
-    </w:rPr>
-  </w:style>
-  <w:style w:type="character" w:styleId="ImportTok" w:customStyle="1">
+      <w:shd w:val="clear" w:color="auto" w:fill="F1F3F5"/>
+    </w:rPr>
+  </w:style>
+  <w:style w:type="character" w:customStyle="1" w:styleId="ImportTok">
     <w:name w:val="ImportTok"/>
     <w:basedOn w:val="VerbatimChar"/>
     <w:qFormat/>
-    <w:rsid w:val="00cf68d1"/>
+    <w:rsid w:val="00CF68D1"/>
     <w:rPr>
       <w:rFonts w:ascii="Consolas" w:hAnsi="Consolas"/>
       <w:color w:val="00769E"/>
       <w:sz w:val="18"/>
-      <w:shd w:fill="F1F3F5" w:val="clear"/>
-    </w:rPr>
-  </w:style>
-  <w:style w:type="character" w:styleId="CommentTok" w:customStyle="1">
+      <w:shd w:val="clear" w:color="auto" w:fill="F1F3F5"/>
+    </w:rPr>
+  </w:style>
+  <w:style w:type="character" w:customStyle="1" w:styleId="CommentTok">
     <w:name w:val="CommentTok"/>
     <w:basedOn w:val="VerbatimChar"/>
     <w:qFormat/>
-    <w:rsid w:val="00cf68d1"/>
+    <w:rsid w:val="00CF68D1"/>
     <w:rPr>
       <w:rFonts w:ascii="Consolas" w:hAnsi="Consolas"/>
       <w:color w:val="5E5E5E"/>
       <w:sz w:val="18"/>
-      <w:shd w:fill="F1F3F5" w:val="clear"/>
-    </w:rPr>
-  </w:style>
-  <w:style w:type="character" w:styleId="DocumentationTok" w:customStyle="1">
+      <w:shd w:val="clear" w:color="auto" w:fill="F1F3F5"/>
+    </w:rPr>
+  </w:style>
+  <w:style w:type="character" w:customStyle="1" w:styleId="DocumentationTok">
     <w:name w:val="DocumentationTok"/>
     <w:basedOn w:val="VerbatimChar"/>
     <w:qFormat/>
-    <w:rsid w:val="00cf68d1"/>
+    <w:rsid w:val="00CF68D1"/>
     <w:rPr>
       <w:rFonts w:ascii="Consolas" w:hAnsi="Consolas"/>
       <w:i/>
       <w:color w:val="5E5E5E"/>
       <w:sz w:val="18"/>
-      <w:shd w:fill="F1F3F5" w:val="clear"/>
-    </w:rPr>
-  </w:style>
-  <w:style w:type="character" w:styleId="AnnotationTok" w:customStyle="1">
+      <w:shd w:val="clear" w:color="auto" w:fill="F1F3F5"/>
+    </w:rPr>
+  </w:style>
+  <w:style w:type="character" w:customStyle="1" w:styleId="AnnotationTok">
     <w:name w:val="AnnotationTok"/>
     <w:basedOn w:val="VerbatimChar"/>
     <w:qFormat/>
-    <w:rsid w:val="00cf68d1"/>
+    <w:rsid w:val="00CF68D1"/>
     <w:rPr>
       <w:rFonts w:ascii="Consolas" w:hAnsi="Consolas"/>
       <w:color w:val="5E5E5E"/>
       <w:sz w:val="18"/>
-      <w:shd w:fill="F1F3F5" w:val="clear"/>
-    </w:rPr>
-  </w:style>
-  <w:style w:type="character" w:styleId="CommentVarTok" w:customStyle="1">
+      <w:shd w:val="clear" w:color="auto" w:fill="F1F3F5"/>
+    </w:rPr>
+  </w:style>
+  <w:style w:type="character" w:customStyle="1" w:styleId="CommentVarTok">
     <w:name w:val="CommentVarTok"/>
     <w:basedOn w:val="VerbatimChar"/>
     <w:qFormat/>
-    <w:rsid w:val="00cf68d1"/>
+    <w:rsid w:val="00CF68D1"/>
     <w:rPr>
       <w:rFonts w:ascii="Consolas" w:hAnsi="Consolas"/>
       <w:i/>
       <w:color w:val="5E5E5E"/>
       <w:sz w:val="18"/>
-      <w:shd w:fill="F1F3F5" w:val="clear"/>
-    </w:rPr>
-  </w:style>
-  <w:style w:type="character" w:styleId="OtherTok" w:customStyle="1">
+      <w:shd w:val="clear" w:color="auto" w:fill="F1F3F5"/>
+    </w:rPr>
+  </w:style>
+  <w:style w:type="character" w:customStyle="1" w:styleId="OtherTok">
     <w:name w:val="OtherTok"/>
     <w:basedOn w:val="VerbatimChar"/>
     <w:qFormat/>
-    <w:rsid w:val="00cf68d1"/>
+    <w:rsid w:val="00CF68D1"/>
     <w:rPr>
       <w:rFonts w:ascii="Consolas" w:hAnsi="Consolas"/>
       <w:color w:val="003B4F"/>
       <w:sz w:val="18"/>
-      <w:shd w:fill="F1F3F5" w:val="clear"/>
-    </w:rPr>
-  </w:style>
-  <w:style w:type="character" w:styleId="FunctionTok" w:customStyle="1">
+      <w:shd w:val="clear" w:color="auto" w:fill="F1F3F5"/>
+    </w:rPr>
+  </w:style>
+  <w:style w:type="character" w:customStyle="1" w:styleId="FunctionTok">
     <w:name w:val="FunctionTok"/>
     <w:basedOn w:val="VerbatimChar"/>
     <w:qFormat/>
-    <w:rsid w:val="00cf68d1"/>
+    <w:rsid w:val="00CF68D1"/>
     <w:rPr>
       <w:rFonts w:ascii="Consolas" w:hAnsi="Consolas"/>
       <w:color w:val="4758AB"/>
       <w:sz w:val="18"/>
-      <w:shd w:fill="F1F3F5" w:val="clear"/>
-    </w:rPr>
-  </w:style>
-  <w:style w:type="character" w:styleId="VariableTok" w:customStyle="1">
+      <w:shd w:val="clear" w:color="auto" w:fill="F1F3F5"/>
+    </w:rPr>
+  </w:style>
+  <w:style w:type="character" w:customStyle="1" w:styleId="VariableTok">
     <w:name w:val="VariableTok"/>
     <w:basedOn w:val="VerbatimChar"/>
     <w:qFormat/>
-    <w:rsid w:val="00cf68d1"/>
+    <w:rsid w:val="00CF68D1"/>
     <w:rPr>
       <w:rFonts w:ascii="Consolas" w:hAnsi="Consolas"/>
       <w:color w:val="111111"/>
       <w:sz w:val="18"/>
-      <w:shd w:fill="F1F3F5" w:val="clear"/>
-    </w:rPr>
-  </w:style>
-  <w:style w:type="character" w:styleId="ControlFlowTok" w:customStyle="1">
+      <w:shd w:val="clear" w:color="auto" w:fill="F1F3F5"/>
+    </w:rPr>
+  </w:style>
+  <w:style w:type="character" w:customStyle="1" w:styleId="ControlFlowTok">
     <w:name w:val="ControlFlowTok"/>
     <w:basedOn w:val="VerbatimChar"/>
     <w:qFormat/>
-    <w:rsid w:val="00cf68d1"/>
+    <w:rsid w:val="00CF68D1"/>
     <w:rPr>
       <w:rFonts w:ascii="Consolas" w:hAnsi="Consolas"/>
       <w:b/>
       <w:color w:val="003B4F"/>
       <w:sz w:val="18"/>
-      <w:shd w:fill="F1F3F5" w:val="clear"/>
-    </w:rPr>
-  </w:style>
-  <w:style w:type="character" w:styleId="OperatorTok" w:customStyle="1">
+      <w:shd w:val="clear" w:color="auto" w:fill="F1F3F5"/>
+    </w:rPr>
+  </w:style>
+  <w:style w:type="character" w:customStyle="1" w:styleId="OperatorTok">
     <w:name w:val="OperatorTok"/>
     <w:basedOn w:val="VerbatimChar"/>
     <w:qFormat/>
-    <w:rsid w:val="00cf68d1"/>
+    <w:rsid w:val="00CF68D1"/>
     <w:rPr>
       <w:rFonts w:ascii="Consolas" w:hAnsi="Consolas"/>
       <w:color w:val="5E5E5E"/>
       <w:sz w:val="18"/>
-      <w:shd w:fill="F1F3F5" w:val="clear"/>
-    </w:rPr>
-  </w:style>
-  <w:style w:type="character" w:styleId="BuiltInTok" w:customStyle="1">
+      <w:shd w:val="clear" w:color="auto" w:fill="F1F3F5"/>
+    </w:rPr>
+  </w:style>
+  <w:style w:type="character" w:customStyle="1" w:styleId="BuiltInTok">
     <w:name w:val="BuiltInTok"/>
     <w:basedOn w:val="VerbatimChar"/>
     <w:qFormat/>
-    <w:rsid w:val="00cf68d1"/>
+    <w:rsid w:val="00CF68D1"/>
     <w:rPr>
       <w:rFonts w:ascii="Consolas" w:hAnsi="Consolas"/>
       <w:color w:val="003B4F"/>
       <w:sz w:val="18"/>
-      <w:shd w:fill="F1F3F5" w:val="clear"/>
-    </w:rPr>
-  </w:style>
-  <w:style w:type="character" w:styleId="ExtensionTok" w:customStyle="1">
+      <w:shd w:val="clear" w:color="auto" w:fill="F1F3F5"/>
+    </w:rPr>
+  </w:style>
+  <w:style w:type="character" w:customStyle="1" w:styleId="ExtensionTok">
     <w:name w:val="ExtensionTok"/>
     <w:basedOn w:val="VerbatimChar"/>
     <w:qFormat/>
-    <w:rsid w:val="00cf68d1"/>
+    <w:rsid w:val="00CF68D1"/>
     <w:rPr>
       <w:rFonts w:ascii="Consolas" w:hAnsi="Consolas"/>
       <w:color w:val="003B4F"/>
       <w:sz w:val="18"/>
-      <w:shd w:fill="F1F3F5" w:val="clear"/>
-    </w:rPr>
-  </w:style>
-  <w:style w:type="character" w:styleId="PreprocessorTok" w:customStyle="1">
+      <w:shd w:val="clear" w:color="auto" w:fill="F1F3F5"/>
+    </w:rPr>
+  </w:style>
+  <w:style w:type="character" w:customStyle="1" w:styleId="PreprocessorTok">
     <w:name w:val="PreprocessorTok"/>
     <w:basedOn w:val="VerbatimChar"/>
     <w:qFormat/>
-    <w:rsid w:val="00cf68d1"/>
+    <w:rsid w:val="00CF68D1"/>
     <w:rPr>
       <w:rFonts w:ascii="Consolas" w:hAnsi="Consolas"/>
       <w:color w:val="AD0000"/>
       <w:sz w:val="18"/>
-      <w:shd w:fill="F1F3F5" w:val="clear"/>
-    </w:rPr>
-  </w:style>
-  <w:style w:type="character" w:styleId="AttributeTok" w:customStyle="1">
+      <w:shd w:val="clear" w:color="auto" w:fill="F1F3F5"/>
+    </w:rPr>
+  </w:style>
+  <w:style w:type="character" w:customStyle="1" w:styleId="AttributeTok">
     <w:name w:val="AttributeTok"/>
     <w:basedOn w:val="VerbatimChar"/>
     <w:qFormat/>
-    <w:rsid w:val="00cf68d1"/>
+    <w:rsid w:val="00CF68D1"/>
     <w:rPr>
       <w:rFonts w:ascii="Consolas" w:hAnsi="Consolas"/>
       <w:color w:val="657422"/>
       <w:sz w:val="18"/>
-      <w:shd w:fill="F1F3F5" w:val="clear"/>
-    </w:rPr>
-  </w:style>
-  <w:style w:type="character" w:styleId="RegionMarkerTok" w:customStyle="1">
+      <w:shd w:val="clear" w:color="auto" w:fill="F1F3F5"/>
+    </w:rPr>
+  </w:style>
+  <w:style w:type="character" w:customStyle="1" w:styleId="RegionMarkerTok">
     <w:name w:val="RegionMarkerTok"/>
     <w:basedOn w:val="VerbatimChar"/>
     <w:qFormat/>
-    <w:rsid w:val="00cf68d1"/>
+    <w:rsid w:val="00CF68D1"/>
     <w:rPr>
       <w:rFonts w:ascii="Consolas" w:hAnsi="Consolas"/>
       <w:color w:val="003B4F"/>
       <w:sz w:val="18"/>
-      <w:shd w:fill="F1F3F5" w:val="clear"/>
-    </w:rPr>
-  </w:style>
-  <w:style w:type="character" w:styleId="InformationTok" w:customStyle="1">
+      <w:shd w:val="clear" w:color="auto" w:fill="F1F3F5"/>
+    </w:rPr>
+  </w:style>
+  <w:style w:type="character" w:customStyle="1" w:styleId="InformationTok">
     <w:name w:val="InformationTok"/>
     <w:basedOn w:val="VerbatimChar"/>
     <w:qFormat/>
-    <w:rsid w:val="00cf68d1"/>
+    <w:rsid w:val="00CF68D1"/>
     <w:rPr>
       <w:rFonts w:ascii="Consolas" w:hAnsi="Consolas"/>
       <w:color w:val="5E5E5E"/>
       <w:sz w:val="18"/>
-      <w:shd w:fill="F1F3F5" w:val="clear"/>
-    </w:rPr>
-  </w:style>
-  <w:style w:type="character" w:styleId="WarningTok" w:customStyle="1">
+      <w:shd w:val="clear" w:color="auto" w:fill="F1F3F5"/>
+    </w:rPr>
+  </w:style>
+  <w:style w:type="character" w:customStyle="1" w:styleId="WarningTok">
     <w:name w:val="WarningTok"/>
     <w:basedOn w:val="VerbatimChar"/>
     <w:qFormat/>
-    <w:rsid w:val="00cf68d1"/>
+    <w:rsid w:val="00CF68D1"/>
     <w:rPr>
       <w:rFonts w:ascii="Consolas" w:hAnsi="Consolas"/>
       <w:i/>
       <w:color w:val="5E5E5E"/>
       <w:sz w:val="18"/>
-      <w:shd w:fill="F1F3F5" w:val="clear"/>
-    </w:rPr>
-  </w:style>
-  <w:style w:type="character" w:styleId="AlertTok" w:customStyle="1">
+      <w:shd w:val="clear" w:color="auto" w:fill="F1F3F5"/>
+    </w:rPr>
+  </w:style>
+  <w:style w:type="character" w:customStyle="1" w:styleId="AlertTok">
     <w:name w:val="AlertTok"/>
     <w:basedOn w:val="VerbatimChar"/>
     <w:qFormat/>
-    <w:rsid w:val="00cf68d1"/>
+    <w:rsid w:val="00CF68D1"/>
     <w:rPr>
       <w:rFonts w:ascii="Consolas" w:hAnsi="Consolas"/>
       <w:color w:val="AD0000"/>
       <w:sz w:val="18"/>
-      <w:shd w:fill="F1F3F5" w:val="clear"/>
-    </w:rPr>
-  </w:style>
-  <w:style w:type="character" w:styleId="ErrorTok" w:customStyle="1">
+      <w:shd w:val="clear" w:color="auto" w:fill="F1F3F5"/>
+    </w:rPr>
+  </w:style>
+  <w:style w:type="character" w:customStyle="1" w:styleId="ErrorTok">
     <w:name w:val="ErrorTok"/>
     <w:basedOn w:val="VerbatimChar"/>
     <w:qFormat/>
-    <w:rsid w:val="00cf68d1"/>
+    <w:rsid w:val="00CF68D1"/>
     <w:rPr>
       <w:rFonts w:ascii="Consolas" w:hAnsi="Consolas"/>
       <w:color w:val="AD0000"/>
       <w:sz w:val="18"/>
-      <w:shd w:fill="F1F3F5" w:val="clear"/>
-    </w:rPr>
-  </w:style>
-  <w:style w:type="character" w:styleId="NormalTok" w:customStyle="1">
+      <w:shd w:val="clear" w:color="auto" w:fill="F1F3F5"/>
+    </w:rPr>
+  </w:style>
+  <w:style w:type="character" w:customStyle="1" w:styleId="NormalTok">
     <w:name w:val="NormalTok"/>
     <w:basedOn w:val="VerbatimChar"/>
     <w:qFormat/>
-    <w:rsid w:val="00cf68d1"/>
+    <w:rsid w:val="00CF68D1"/>
     <w:rPr>
       <w:rFonts w:ascii="Consolas" w:hAnsi="Consolas"/>
       <w:color w:val="003B4F"/>
       <w:sz w:val="18"/>
-      <w:shd w:fill="F1F3F5" w:val="clear"/>
-    </w:rPr>
-  </w:style>
-  <w:style w:type="character" w:styleId="FooterChar" w:customStyle="1">
+      <w:shd w:val="clear" w:color="auto" w:fill="F1F3F5"/>
+    </w:rPr>
+  </w:style>
+  <w:style w:type="character" w:customStyle="1" w:styleId="FooterChar">
     <w:name w:val="Footer Char"/>
     <w:basedOn w:val="DefaultParagraphFont"/>
     <w:link w:val="Footer"/>
     <w:qFormat/>
-    <w:rsid w:val="000a2f4c"/>
-    <w:rPr>
-      <w:rFonts w:ascii="Excalifont" w:hAnsi="Excalifont"/>
+    <w:rsid w:val="008D4946"/>
+    <w:rPr>
+      <w:rFonts w:ascii="Arial" w:hAnsi="Arial"/>
       <w:sz w:val="22"/>
     </w:rPr>
   </w:style>
   <w:style w:type="character" w:styleId="PageNumber">
     <w:name w:val="page number"/>
     <w:basedOn w:val="DefaultParagraphFont"/>
-    <w:rsid w:val="000a2f4c"/>
-    <w:rPr/>
-  </w:style>
-  <w:style w:type="character" w:styleId="PlainTextChar" w:customStyle="1">
+    <w:rsid w:val="000A2F4C"/>
+  </w:style>
+  <w:style w:type="character" w:customStyle="1" w:styleId="PlainTextChar">
     <w:name w:val="Plain Text Char"/>
     <w:basedOn w:val="DefaultParagraphFont"/>
     <w:link w:val="PlainText"/>
     <w:qFormat/>
-    <w:rsid w:val="00cf68d1"/>
+    <w:rsid w:val="00CF68D1"/>
     <w:rPr>
       <w:rFonts w:ascii="Consolas" w:hAnsi="Consolas" w:cs="Consolas"/>
       <w:sz w:val="18"/>
       <w:szCs w:val="21"/>
     </w:rPr>
   </w:style>
-  <w:style w:type="paragraph" w:styleId="Heading">
+  <w:style w:type="paragraph" w:customStyle="1" w:styleId="Heading">
     <w:name w:val="Heading"/>
     <w:basedOn w:val="Normal"/>
     <w:next w:val="BodyText"/>
     <w:qFormat/>
     <w:pPr>
-      <w:keepNext w:val="true"/>
+      <w:keepNext/>
       <w:spacing w:before="240" w:after="120"/>
     </w:pPr>
     <w:rPr>
-      <w:rFonts w:ascii="Liberation Sans" w:hAnsi="Liberation Sans" w:eastAsia="PingFang SC" w:cs="Arial Unicode MS"/>
+      <w:rFonts w:ascii="Liberation Sans" w:eastAsia="PingFang SC" w:hAnsi="Liberation Sans" w:cs="Arial Unicode MS"/>
       <w:sz w:val="28"/>
       <w:szCs w:val="28"/>
     </w:rPr>
@@ -5122,18 +5605,14 @@
     <w:name w:val="Body Text"/>
     <w:basedOn w:val="Normal"/>
     <w:qFormat/>
-    <w:rsid w:val="007225f1"/>
+    <w:rsid w:val="007225F1"/>
     <w:pPr>
       <w:spacing w:before="180" w:after="180"/>
     </w:pPr>
-    <w:rPr>
-      <w:rFonts w:ascii="Arial" w:hAnsi="Arial"/>
-    </w:rPr>
   </w:style>
   <w:style w:type="paragraph" w:styleId="List">
     <w:name w:val="List"/>
     <w:basedOn w:val="BodyText"/>
-    <w:pPr/>
     <w:rPr>
       <w:rFonts w:cs="Arial Unicode MS"/>
     </w:rPr>
@@ -5144,13 +5623,13 @@
     <w:link w:val="CaptionChar"/>
     <w:qFormat/>
     <w:pPr>
-      <w:spacing w:before="100" w:after="120"/>
+      <w:spacing w:after="120"/>
     </w:pPr>
     <w:rPr>
       <w:i/>
     </w:rPr>
   </w:style>
-  <w:style w:type="paragraph" w:styleId="Index">
+  <w:style w:type="paragraph" w:customStyle="1" w:styleId="Index">
     <w:name w:val="Index"/>
     <w:basedOn w:val="Normal"/>
     <w:qFormat/>
@@ -5161,20 +5640,18 @@
       <w:rFonts w:cs="Arial Unicode MS"/>
     </w:rPr>
   </w:style>
-  <w:style w:type="paragraph" w:styleId="FirstParagraph" w:customStyle="1">
+  <w:style w:type="paragraph" w:customStyle="1" w:styleId="FirstParagraph">
     <w:name w:val="First Paragraph"/>
     <w:basedOn w:val="BodyText"/>
     <w:next w:val="BodyText"/>
     <w:qFormat/>
-    <w:rsid w:val="007225f1"/>
-    <w:pPr/>
-    <w:rPr/>
-  </w:style>
-  <w:style w:type="paragraph" w:styleId="Compact" w:customStyle="1">
+    <w:rsid w:val="007225F1"/>
+  </w:style>
+  <w:style w:type="paragraph" w:customStyle="1" w:styleId="Compact">
     <w:name w:val="Compact"/>
     <w:basedOn w:val="BodyText"/>
     <w:qFormat/>
-    <w:rsid w:val="007225f1"/>
+    <w:rsid w:val="007225F1"/>
     <w:pPr>
       <w:spacing w:before="0" w:after="0"/>
     </w:pPr>
@@ -5189,13 +5666,13 @@
     <w:link w:val="TitleChar"/>
     <w:uiPriority w:val="10"/>
     <w:qFormat/>
-    <w:rsid w:val="007225f1"/>
+    <w:rsid w:val="007225F1"/>
     <w:pPr>
-      <w:spacing w:before="100" w:after="80"/>
+      <w:spacing w:after="80"/>
       <w:contextualSpacing/>
     </w:pPr>
     <w:rPr>
-      <w:rFonts w:ascii="Arial" w:hAnsi="Arial" w:eastAsia="" w:cs="" w:cstheme="majorBidi" w:eastAsiaTheme="majorEastAsia"/>
+      <w:rFonts w:eastAsiaTheme="majorEastAsia" w:cstheme="majorBidi"/>
       <w:b/>
       <w:szCs w:val="56"/>
     </w:rPr>
@@ -5207,25 +5684,24 @@
     <w:link w:val="SubtitleChar"/>
     <w:uiPriority w:val="11"/>
     <w:qFormat/>
-    <w:rsid w:val="00a10fd9"/>
-    <w:pPr/>
+    <w:rsid w:val="00A10FD9"/>
     <w:rPr>
       <w:spacing w:val="15"/>
       <w:szCs w:val="28"/>
     </w:rPr>
   </w:style>
-  <w:style w:type="paragraph" w:styleId="Author" w:customStyle="1">
+  <w:style w:type="paragraph" w:customStyle="1" w:styleId="Author">
     <w:name w:val="Author"/>
     <w:basedOn w:val="Title"/>
     <w:next w:val="BodyText"/>
     <w:qFormat/>
-    <w:rsid w:val="003a2534"/>
+    <w:rsid w:val="003A2534"/>
     <w:pPr>
-      <w:keepNext w:val="true"/>
+      <w:keepNext/>
       <w:keepLines/>
     </w:pPr>
     <w:rPr>
-      <w:b w:val="false"/>
+      <w:b w:val="0"/>
       <w:szCs w:val="24"/>
     </w:rPr>
   </w:style>
@@ -5234,46 +5710,46 @@
     <w:basedOn w:val="Title"/>
     <w:next w:val="BodyText"/>
     <w:qFormat/>
-    <w:rsid w:val="000175b8"/>
+    <w:rsid w:val="000175B8"/>
     <w:pPr>
-      <w:keepNext w:val="true"/>
+      <w:keepNext/>
       <w:keepLines/>
     </w:pPr>
     <w:rPr>
-      <w:b w:val="false"/>
+      <w:b w:val="0"/>
       <w:szCs w:val="24"/>
     </w:rPr>
   </w:style>
-  <w:style w:type="paragraph" w:styleId="AbstractTitle" w:customStyle="1">
+  <w:style w:type="paragraph" w:customStyle="1" w:styleId="AbstractTitle">
     <w:name w:val="Abstract Title"/>
     <w:basedOn w:val="Normal"/>
     <w:next w:val="Abstract"/>
     <w:qFormat/>
-    <w:rsid w:val="001d057a"/>
+    <w:rsid w:val="001D057A"/>
     <w:pPr>
-      <w:keepNext w:val="true"/>
+      <w:keepNext/>
       <w:keepLines/>
-      <w:spacing w:before="100" w:after="0"/>
+      <w:spacing w:after="0"/>
       <w:jc w:val="center"/>
     </w:pPr>
     <w:rPr>
       <w:b/>
-      <w:color w:themeColor="background1" w:val="FFFFFF"/>
+      <w:color w:val="FFFFFF" w:themeColor="background1"/>
       <w:sz w:val="8"/>
       <w:szCs w:val="20"/>
     </w:rPr>
   </w:style>
-  <w:style w:type="paragraph" w:styleId="Abstract" w:customStyle="1">
+  <w:style w:type="paragraph" w:customStyle="1" w:styleId="Abstract">
     <w:name w:val="Abstract"/>
     <w:basedOn w:val="Normal"/>
     <w:next w:val="BodyText"/>
     <w:qFormat/>
-    <w:rsid w:val="00c97ba2"/>
+    <w:rsid w:val="00C97BA2"/>
     <w:pPr>
-      <w:keepNext w:val="true"/>
+      <w:keepNext/>
       <w:keepLines/>
       <w:spacing w:before="240" w:after="120"/>
-      <w:ind w:start="1440" w:end="1440"/>
+      <w:ind w:left="1440" w:right="1440"/>
     </w:pPr>
     <w:rPr>
       <w:sz w:val="20"/>
@@ -5284,11 +5760,7 @@
     <w:name w:val="Bibliography"/>
     <w:basedOn w:val="Normal"/>
     <w:qFormat/>
-    <w:rsid w:val="007225f1"/>
-    <w:pPr/>
-    <w:rPr>
-      <w:rFonts w:ascii="Arial" w:hAnsi="Arial"/>
-    </w:rPr>
+    <w:rsid w:val="007225F1"/>
   </w:style>
   <w:style w:type="paragraph" w:styleId="BlockText">
     <w:name w:val="Block Text"/>
@@ -5299,9 +5771,8 @@
     <w:qFormat/>
     <w:pPr>
       <w:spacing w:before="100" w:after="100"/>
-      <w:ind w:start="480" w:end="480"/>
+      <w:ind w:left="480" w:right="480"/>
     </w:pPr>
-    <w:rPr/>
   </w:style>
   <w:style w:type="paragraph" w:styleId="FootnoteText">
     <w:name w:val="footnote text"/>
@@ -5309,13 +5780,12 @@
     <w:uiPriority w:val="9"/>
     <w:unhideWhenUsed/>
     <w:qFormat/>
-    <w:rsid w:val="00a57edb"/>
-    <w:pPr/>
+    <w:rsid w:val="00A57EDB"/>
     <w:rPr>
       <w:sz w:val="16"/>
     </w:rPr>
   </w:style>
-  <w:style w:type="paragraph" w:styleId="FootnoteBlockText" w:customStyle="1">
+  <w:style w:type="paragraph" w:customStyle="1" w:styleId="FootnoteBlockText">
     <w:name w:val="Footnote Block Text"/>
     <w:basedOn w:val="FootnoteText"/>
     <w:next w:val="FootnoteText"/>
@@ -5323,74 +5793,63 @@
     <w:unhideWhenUsed/>
     <w:qFormat/>
     <w:pPr>
-      <w:ind w:start="480" w:end="480"/>
+      <w:ind w:left="480" w:right="480"/>
     </w:pPr>
-    <w:rPr/>
-  </w:style>
-  <w:style w:type="paragraph" w:styleId="DefinitionTerm" w:customStyle="1">
+  </w:style>
+  <w:style w:type="paragraph" w:customStyle="1" w:styleId="DefinitionTerm">
     <w:name w:val="Definition Term"/>
     <w:basedOn w:val="Normal"/>
     <w:next w:val="Definition"/>
     <w:qFormat/>
     <w:pPr>
-      <w:keepNext w:val="true"/>
+      <w:keepNext/>
       <w:keepLines/>
-      <w:spacing w:before="100" w:after="0"/>
+      <w:spacing w:after="0"/>
     </w:pPr>
     <w:rPr>
       <w:b/>
     </w:rPr>
   </w:style>
-  <w:style w:type="paragraph" w:styleId="Definition" w:customStyle="1">
+  <w:style w:type="paragraph" w:customStyle="1" w:styleId="Definition">
     <w:name w:val="Definition"/>
     <w:basedOn w:val="Normal"/>
     <w:qFormat/>
-    <w:pPr/>
-    <w:rPr/>
-  </w:style>
-  <w:style w:type="paragraph" w:styleId="TableCaption" w:customStyle="1">
+  </w:style>
+  <w:style w:type="paragraph" w:customStyle="1" w:styleId="TableCaption">
     <w:name w:val="Table Caption"/>
     <w:basedOn w:val="Caption"/>
     <w:qFormat/>
     <w:pPr>
-      <w:keepNext w:val="true"/>
+      <w:keepNext/>
     </w:pPr>
-    <w:rPr/>
-  </w:style>
-  <w:style w:type="paragraph" w:styleId="ImageCaption" w:customStyle="1">
+  </w:style>
+  <w:style w:type="paragraph" w:customStyle="1" w:styleId="ImageCaption">
     <w:name w:val="Image Caption"/>
     <w:basedOn w:val="Caption"/>
     <w:qFormat/>
-    <w:rsid w:val="007225f1"/>
-    <w:pPr/>
-    <w:rPr>
-      <w:rFonts w:ascii="Arial" w:hAnsi="Arial"/>
+    <w:rsid w:val="007225F1"/>
+    <w:rPr>
       <w:b/>
-      <w:i w:val="false"/>
+      <w:i w:val="0"/>
       <w:sz w:val="20"/>
     </w:rPr>
   </w:style>
-  <w:style w:type="paragraph" w:styleId="Figure" w:customStyle="1">
+  <w:style w:type="paragraph" w:customStyle="1" w:styleId="Figure">
     <w:name w:val="Figure"/>
     <w:basedOn w:val="Normal"/>
     <w:qFormat/>
-    <w:pPr/>
-    <w:rPr/>
-  </w:style>
-  <w:style w:type="paragraph" w:styleId="CaptionedFigure" w:customStyle="1">
+  </w:style>
+  <w:style w:type="paragraph" w:customStyle="1" w:styleId="CaptionedFigure">
     <w:name w:val="Captioned Figure"/>
     <w:basedOn w:val="Figure"/>
     <w:qFormat/>
     <w:pPr>
-      <w:keepNext w:val="true"/>
+      <w:keepNext/>
     </w:pPr>
-    <w:rPr/>
   </w:style>
   <w:style w:type="paragraph" w:styleId="IndexHeading">
     <w:name w:val="index heading"/>
     <w:basedOn w:val="Heading"/>
-    <w:pPr/>
-    <w:rPr/>
   </w:style>
   <w:style w:type="paragraph" w:styleId="TOCHeading">
     <w:name w:val="TOC Heading"/>
@@ -5399,22 +5858,21 @@
     <w:uiPriority w:val="39"/>
     <w:unhideWhenUsed/>
     <w:qFormat/>
-    <w:rsid w:val="00c97ba2"/>
+    <w:rsid w:val="008D4946"/>
     <w:pPr>
-      <w:pageBreakBefore/>
-      <w:widowControl w:val="false"/>
-      <w:spacing w:lineRule="auto" w:line="259" w:before="220" w:after="100"/>
+      <w:widowControl w:val="0"/>
+      <w:spacing w:before="220" w:line="259" w:lineRule="auto"/>
     </w:pPr>
     <w:rPr>
       <w:b/>
     </w:rPr>
   </w:style>
-  <w:style w:type="paragraph" w:styleId="SourceCode" w:customStyle="1">
+  <w:style w:type="paragraph" w:customStyle="1" w:styleId="SourceCode">
     <w:name w:val="Source Code"/>
     <w:basedOn w:val="Normal"/>
     <w:link w:val="VerbatimChar"/>
     <w:qFormat/>
-    <w:rsid w:val="00cf68d1"/>
+    <w:rsid w:val="00CF68D1"/>
     <w:pPr>
       <w:shd w:val="clear" w:color="auto" w:fill="F1F3F5"/>
     </w:pPr>
@@ -5429,11 +5887,10 @@
     <w:next w:val="Normal"/>
     <w:autoRedefine/>
     <w:uiPriority w:val="39"/>
-    <w:rsid w:val="00070816"/>
+    <w:rsid w:val="008D4946"/>
     <w:pPr>
-      <w:ind w:start="220"/>
+      <w:ind w:left="220"/>
     </w:pPr>
-    <w:rPr/>
   </w:style>
   <w:style w:type="paragraph" w:styleId="TOC3">
     <w:name w:val="toc 3"/>
@@ -5443,60 +5900,55 @@
     <w:uiPriority w:val="39"/>
     <w:rsid w:val="00070816"/>
     <w:pPr>
-      <w:ind w:start="440"/>
+      <w:ind w:left="440"/>
     </w:pPr>
-    <w:rPr/>
-  </w:style>
-  <w:style w:type="paragraph" w:styleId="HeaderandFooter">
+  </w:style>
+  <w:style w:type="paragraph" w:customStyle="1" w:styleId="HeaderandFooter">
     <w:name w:val="Header and Footer"/>
     <w:basedOn w:val="Normal"/>
     <w:qFormat/>
-    <w:pPr/>
-    <w:rPr/>
+    <w:rsid w:val="008D4946"/>
   </w:style>
   <w:style w:type="paragraph" w:styleId="Footer">
     <w:name w:val="footer"/>
     <w:basedOn w:val="Normal"/>
     <w:link w:val="FooterChar"/>
-    <w:rsid w:val="000a2f4c"/>
+    <w:rsid w:val="008D4946"/>
     <w:pPr>
       <w:tabs>
-        <w:tab w:val="clear" w:pos="720"/>
-        <w:tab w:val="center" w:pos="4680" w:leader="none"/>
-        <w:tab w:val="right" w:pos="9360" w:leader="none"/>
+        <w:tab w:val="center" w:pos="4680"/>
+        <w:tab w:val="right" w:pos="9360"/>
       </w:tabs>
-      <w:spacing w:before="100" w:after="0"/>
+      <w:spacing w:after="0"/>
     </w:pPr>
-    <w:rPr/>
-  </w:style>
-  <w:style w:type="paragraph" w:styleId="Commentary" w:customStyle="1">
+  </w:style>
+  <w:style w:type="paragraph" w:customStyle="1" w:styleId="Commentary">
     <w:name w:val="Commentary"/>
     <w:basedOn w:val="BodyText"/>
     <w:qFormat/>
-    <w:rsid w:val="002c0ca5"/>
+    <w:rsid w:val="002C0CA5"/>
     <w:pPr>
-      <w:ind w:start="720" w:end="720"/>
+      <w:ind w:left="720" w:right="720"/>
     </w:pPr>
     <w:rPr>
       <w:rFonts w:ascii="Excalifont" w:hAnsi="Excalifont"/>
     </w:rPr>
   </w:style>
-  <w:style w:type="paragraph" w:styleId="RLIndented" w:customStyle="1">
+  <w:style w:type="paragraph" w:customStyle="1" w:styleId="RLIndented">
     <w:name w:val="RLIndented"/>
     <w:basedOn w:val="BodyText"/>
     <w:qFormat/>
-    <w:rsid w:val="007b5aaf"/>
+    <w:rsid w:val="007B5AAF"/>
     <w:pPr>
-      <w:ind w:start="1440" w:end="1440"/>
+      <w:ind w:left="1440" w:right="1440"/>
     </w:pPr>
-    <w:rPr/>
   </w:style>
   <w:style w:type="paragraph" w:styleId="PlainText">
     <w:name w:val="Plain Text"/>
     <w:basedOn w:val="Normal"/>
     <w:link w:val="PlainTextChar"/>
     <w:qFormat/>
-    <w:rsid w:val="00cf68d1"/>
+    <w:rsid w:val="00CF68D1"/>
     <w:pPr>
       <w:spacing w:before="0" w:after="0"/>
     </w:pPr>
@@ -5506,33 +5958,17 @@
       <w:szCs w:val="21"/>
     </w:rPr>
   </w:style>
-  <w:style w:type="paragraph" w:styleId="FrameContents">
+  <w:style w:type="paragraph" w:customStyle="1" w:styleId="FrameContentsuser">
+    <w:name w:val="Frame Contents (user)"/>
+    <w:basedOn w:val="Normal"/>
+    <w:qFormat/>
+    <w:rsid w:val="008D4946"/>
+  </w:style>
+  <w:style w:type="paragraph" w:customStyle="1" w:styleId="FrameContents">
     <w:name w:val="Frame Contents"/>
     <w:basedOn w:val="Normal"/>
     <w:qFormat/>
-    <w:pPr/>
-    <w:rPr/>
-  </w:style>
-  <w:style w:type="numbering" w:styleId="NoList" w:default="1">
-    <w:name w:val="No List"/>
-    <w:uiPriority w:val="99"/>
-    <w:semiHidden/>
-    <w:unhideWhenUsed/>
-    <w:qFormat/>
-  </w:style>
-  <w:style w:type="table" w:default="1" w:styleId="TableNormal">
-    <w:name w:val="Normal Table"/>
-    <w:uiPriority w:val="99"/>
-    <w:semiHidden/>
-    <w:unhideWhenUsed/>
-    <w:tblPr>
-      <w:tblCellMar>
-        <w:top w:w="0" w:type="dxa"/>
-        <w:left w:w="108" w:type="dxa"/>
-        <w:bottom w:w="0" w:type="dxa"/>
-        <w:right w:w="108" w:type="dxa"/>
-      </w:tblCellMar>
-    </w:tblPr>
+    <w:rsid w:val="008D4946"/>
   </w:style>
   <w:style w:type="table" w:customStyle="1" w:styleId="Table">
     <w:name w:val="Table"/>
@@ -5551,17 +5987,34 @@
       <w:tblPr/>
       <w:tcPr>
         <w:tcBorders>
-          <w:bottom w:val="single" w:color="auto" w:sz="0" w:space="0"/>
+          <w:bottom w:val="single" w:sz="0" w:space="0" w:color="auto"/>
         </w:tcBorders>
         <w:vAlign w:val="bottom"/>
       </w:tcPr>
     </w:tblStylePr>
   </w:style>
+  <w:style w:type="paragraph" w:styleId="TOC1">
+    <w:name w:val="toc 1"/>
+    <w:basedOn w:val="Normal"/>
+    <w:next w:val="Normal"/>
+    <w:autoRedefine/>
+    <w:rsid w:val="008D4946"/>
+  </w:style>
+  <w:style w:type="paragraph" w:styleId="TOC4">
+    <w:name w:val="toc 4"/>
+    <w:basedOn w:val="Normal"/>
+    <w:next w:val="Normal"/>
+    <w:autoRedefine/>
+    <w:rsid w:val="008D4946"/>
+    <w:pPr>
+      <w:ind w:left="660"/>
+    </w:pPr>
+  </w:style>
 </w:styles>
 </file>
 
 <file path=word/theme/theme1.xml><?xml version="1.0" encoding="utf-8"?>
-<a:theme xmlns:a="http://schemas.openxmlformats.org/drawingml/2006/main" xmlns:r="http://schemas.openxmlformats.org/officeDocument/2006/relationships" name="Office Theme">
+<a:theme xmlns:a="http://schemas.openxmlformats.org/drawingml/2006/main" name="Office Theme">
   <a:themeElements>
     <a:clrScheme name="Office">
       <a:dk1>
@@ -5603,12 +6056,12 @@
     </a:clrScheme>
     <a:fontScheme name="Office">
       <a:majorFont>
-        <a:latin typeface="Aptos Display" panose="02110004020202020204" pitchFamily="0" charset="1"/>
+        <a:latin typeface="Aptos Display" panose="02110004020202020204"/>
         <a:ea typeface=""/>
         <a:cs typeface=""/>
       </a:majorFont>
       <a:minorFont>
-        <a:latin typeface="Aptos" panose="02110004020202020204" pitchFamily="0" charset="1"/>
+        <a:latin typeface="Aptos" panose="02110004020202020204"/>
         <a:ea typeface=""/>
         <a:cs typeface=""/>
       </a:minorFont>
@@ -5640,7 +6093,7 @@
             </a:gs>
           </a:gsLst>
           <a:lin ang="5400000" scaled="0"/>
-          <a:tileRect l="0" t="0" r="0" b="0"/>
+          <a:tileRect/>
         </a:gradFill>
         <a:gradFill>
           <a:gsLst>
@@ -5664,7 +6117,7 @@
             </a:gs>
           </a:gsLst>
           <a:lin ang="5400000" scaled="0"/>
-          <a:tileRect l="0" t="0" r="0" b="0"/>
+          <a:tileRect/>
         </a:gradFill>
       </a:fillStyleLst>
       <a:lnStyleLst>
@@ -5724,10 +6177,12 @@
             </a:gs>
           </a:gsLst>
           <a:lin ang="5400000" scaled="0"/>
-          <a:tileRect l="0" t="0" r="0" b="0"/>
+          <a:tileRect/>
         </a:gradFill>
       </a:bgFillStyleLst>
     </a:fmtScheme>
   </a:themeElements>
+  <a:objectDefaults/>
+  <a:extraClrSchemeLst/>
 </a:theme>
 </file>
</xml_diff>